<commit_message>
Fix Cross Reference rules
</commit_message>
<xml_diff>
--- a/docs/test-documents/thesis-validator-test-errors.docx
+++ b/docs/test-documents/thesis-validator-test-errors.docx
@@ -3841,6 +3841,9 @@
             <w:pPr>
               <w:pStyle w:val="Tabletext"/>
             </w:pPr>
+            <w:r>
+              <w:t>Mingi mõiste</w:t>
+            </w:r>
           </w:p>
         </w:tc>
         <w:tc>
@@ -3851,6 +3854,9 @@
             <w:pPr>
               <w:pStyle w:val="Tabletext"/>
             </w:pPr>
+            <w:r>
+              <w:t>Siin on mingi mõiste</w:t>
+            </w:r>
           </w:p>
         </w:tc>
       </w:tr>
@@ -5712,7 +5718,14 @@
           <w:bCs/>
         </w:rPr>
         <w:lastRenderedPageBreak/>
-        <w:t>Minu lemmik peatükk</w:t>
+        <w:t>Minu lemmik pe</w:t>
+      </w:r>
+      <w:r>
+        <w:rPr>
+          <w:b w:val="0"/>
+          <w:bCs/>
+        </w:rPr>
+        <w:t>atükk</w:t>
       </w:r>
     </w:p>
     <w:p>

</xml_diff>

<commit_message>
improve Language rule evaluation
</commit_message>
<xml_diff>
--- a/docs/test-documents/thesis-validator-test-errors.docx
+++ b/docs/test-documents/thesis-validator-test-errors.docx
@@ -120,16 +120,8 @@
               <w:rPr>
                 <w:caps w:val="0"/>
               </w:rPr>
-              <w:t xml:space="preserve">Lõputöö </w:t>
+              <w:t>Lõputöö validaator</w:t>
             </w:r>
-            <w:proofErr w:type="spellStart"/>
-            <w:r>
-              <w:rPr>
-                <w:caps w:val="0"/>
-              </w:rPr>
-              <w:t>validaator</w:t>
-            </w:r>
-            <w:proofErr w:type="spellEnd"/>
             <w:r>
               <w:rPr>
                 <w:caps w:val="0"/>
@@ -152,16 +144,8 @@
               <w:rPr>
                 <w:caps w:val="0"/>
               </w:rPr>
-              <w:t xml:space="preserve"> </w:t>
+              <w:t xml:space="preserve"> testtdokument</w:t>
             </w:r>
-            <w:proofErr w:type="spellStart"/>
-            <w:r>
-              <w:rPr>
-                <w:caps w:val="0"/>
-              </w:rPr>
-              <w:t>testtdokument</w:t>
-            </w:r>
-            <w:proofErr w:type="spellEnd"/>
           </w:p>
         </w:tc>
       </w:tr>
@@ -552,17 +536,29 @@
     <w:p>
       <w:pPr>
         <w:jc w:val="right"/>
-      </w:pPr>
-      <w:r>
-        <w:t>Käesolev lõik on näidistekst, mida kasutatakse dokumendi vormistuse testimiseks. Tekst ei oma sisulist tähendust ning on koostatud üksnes vormistusnõuete kontrollimise eesmärgil. Lõigu pikkus on valitud selliselt, et see vastaks tüüpilise akadeemilise teksti mahule.</w:t>
+        <w:rPr>
+          <w:bCs/>
+        </w:rPr>
+      </w:pPr>
+      <w:r>
+        <w:rPr>
+          <w:bCs/>
+        </w:rPr>
+        <w:t>This paragraph is sample text used for testing document formatting. The text has no meaningful content and has been created solely for the purpose of validating formatting requirements. The length of the paragraph has been chosen to correspond to the volume of a typical academic text.</w:t>
       </w:r>
     </w:p>
     <w:p>
       <w:pPr>
         <w:jc w:val="left"/>
-      </w:pPr>
-      <w:r>
-        <w:t>Järgnevas lõigus käsitletakse täiendavaid aspekte, mis on vajalikud testimise läbiviimiseks. Erinevad vormistuselemendid, sealhulgas pealkirjad, lõigud ja tabelid, on paigutatud dokumenti selliselt, et valideerimisreeglite kontrollimiseks oleks piisavalt materjali. Testimise käigus kontrollitakse nii vormistuse kui ka struktuuri vastavust nõuetele.</w:t>
+        <w:rPr>
+          <w:bCs/>
+        </w:rPr>
+      </w:pPr>
+      <w:r>
+        <w:rPr>
+          <w:bCs/>
+        </w:rPr>
+        <w:t>The following paragraph covers additional aspects necessary for conducting the testing. Various formatting elements, including headings, paragraphs and tables, have been placed in the document in such a way that there is sufficient material for checking validation rules. During testing, both formatting and structural compliance with the requirements are verified.</w:t>
       </w:r>
     </w:p>
     <w:p>
@@ -617,3030 +613,161 @@
       <w:pPr>
         <w:pStyle w:val="Heading"/>
       </w:pPr>
-      <w:proofErr w:type="spellStart"/>
       <w:r>
         <w:lastRenderedPageBreak/>
         <w:t>Abstract</w:t>
       </w:r>
-      <w:proofErr w:type="spellEnd"/>
     </w:p>
     <w:p>
       <w:pPr>
         <w:pStyle w:val="NormalBold"/>
       </w:pPr>
-      <w:proofErr w:type="spellStart"/>
-      <w:r>
-        <w:t>Thesis</w:t>
-      </w:r>
-      <w:proofErr w:type="spellEnd"/>
-      <w:r>
+      <w:r>
+        <w:t>Thesis Validator: Correct Test Document</w:t>
+      </w:r>
+    </w:p>
+    <w:p>
+      <w:pPr>
+        <w:rPr>
+          <w:bCs/>
+        </w:rPr>
+      </w:pPr>
+      <w:r>
+        <w:rPr>
+          <w:bCs/>
+        </w:rPr>
+        <w:t>This paragraph is sample text used for testing document formatting. The text has no meaningful content and has been created solely for the purpose of validating formatting requirements. The length of the paragraph has been chosen to correspond to the volume of a typical academic text.</w:t>
+      </w:r>
+    </w:p>
+    <w:p>
+      <w:pPr>
+        <w:rPr>
+          <w:bCs/>
+        </w:rPr>
+      </w:pPr>
+      <w:r>
+        <w:rPr>
+          <w:bCs/>
+        </w:rPr>
+        <w:t>The following paragraph covers additional aspects necessary for conducting the testing. Various formatting elements, including headings, paragraphs and tables, have been placed in the document in such a way that there is sufficient material for checking validation rules. During testing, both formatting and structural compliance with the requirements are verified.</w:t>
+      </w:r>
+    </w:p>
+    <w:p>
+      <w:pPr>
+        <w:rPr>
+          <w:bCs/>
+        </w:rPr>
+      </w:pPr>
+      <w:r>
+        <w:rPr>
+          <w:bCs/>
+        </w:rPr>
+        <w:t>This paragraph is sample text used for testing document formatting. The text has no meaningful content and has been created solely for the purpose of validating formatting requirements. The length of the paragraph has been chosen to correspond to the volume of a typical academic text.</w:t>
+      </w:r>
+    </w:p>
+    <w:p>
+      <w:pPr>
+        <w:rPr>
+          <w:bCs/>
+        </w:rPr>
+      </w:pPr>
+      <w:r>
+        <w:rPr>
+          <w:bCs/>
+        </w:rPr>
+        <w:t>The following paragraph covers additional aspects necessary for conducting the testing. Various formatting elements, including headings, paragraphs and tables, have been placed in the document in such a way that there is sufficient material for checking validation rules. During testing, both formatting and structural compliance with the requirements are verified.</w:t>
+      </w:r>
+    </w:p>
+    <w:p>
+      <w:pPr>
+        <w:rPr>
+          <w:bCs/>
+        </w:rPr>
+      </w:pPr>
+      <w:r>
+        <w:rPr>
+          <w:bCs/>
+        </w:rPr>
+        <w:t>This paragraph is sample text used for testing document formatting. The text has no meaningful content and has been created solely for the purpose of validating formatting requirements. The length of the paragraph has been chosen to correspond to the volume of a typical academic text.</w:t>
+      </w:r>
+    </w:p>
+    <w:p>
+      <w:pPr>
+        <w:rPr>
+          <w:bCs/>
+        </w:rPr>
+      </w:pPr>
+      <w:r>
+        <w:rPr>
+          <w:bCs/>
+        </w:rPr>
+        <w:t xml:space="preserve">The thesis is in </w:t>
+      </w:r>
+      <w:r>
+        <w:rPr>
+          <w:bCs/>
+        </w:rPr>
+        <w:t>Estonian</w:t>
+      </w:r>
+      <w:r>
+        <w:rPr>
+          <w:bCs/>
+        </w:rPr>
+        <w:t xml:space="preserve"> and contains </w:t>
+      </w:r>
+      <w:r>
+        <w:rPr>
+          <w:bCs/>
+        </w:rPr>
+        <w:t>31</w:t>
+      </w:r>
+      <w:r>
+        <w:rPr>
+          <w:bCs/>
+        </w:rPr>
+        <w:t xml:space="preserve"> pages of text, </w:t>
+      </w:r>
+      <w:r>
+        <w:rPr>
+          <w:bCs/>
+        </w:rPr>
+        <w:t>4</w:t>
+      </w:r>
+      <w:r>
+        <w:rPr>
+          <w:bCs/>
+        </w:rPr>
+        <w:t xml:space="preserve"> chapters, </w:t>
+      </w:r>
+      <w:r>
+        <w:rPr>
+          <w:bCs/>
+        </w:rPr>
+        <w:t>3</w:t>
+      </w:r>
+      <w:r>
+        <w:rPr>
+          <w:bCs/>
+        </w:rPr>
         <w:t xml:space="preserve"> </w:t>
       </w:r>
-      <w:proofErr w:type="spellStart"/>
-      <w:r>
-        <w:t>Validator</w:t>
-      </w:r>
-      <w:proofErr w:type="spellEnd"/>
-      <w:r>
-        <w:t xml:space="preserve">: </w:t>
-      </w:r>
-      <w:proofErr w:type="spellStart"/>
-      <w:r>
-        <w:t>Correct</w:t>
-      </w:r>
-      <w:proofErr w:type="spellEnd"/>
-      <w:r>
-        <w:t xml:space="preserve"> Test Document</w:t>
-      </w:r>
-    </w:p>
-    <w:p>
-      <w:pPr>
+      <w:r>
         <w:rPr>
           <w:bCs/>
         </w:rPr>
-      </w:pPr>
-      <w:proofErr w:type="spellStart"/>
+        <w:t xml:space="preserve">figures, </w:t>
+      </w:r>
       <w:r>
         <w:rPr>
           <w:bCs/>
         </w:rPr>
-        <w:t>This</w:t>
-      </w:r>
-      <w:proofErr w:type="spellEnd"/>
+        <w:t>1</w:t>
+      </w:r>
       <w:r>
         <w:rPr>
           <w:bCs/>
         </w:rPr>
-        <w:t xml:space="preserve"> </w:t>
-      </w:r>
-      <w:proofErr w:type="spellStart"/>
-      <w:r>
-        <w:rPr>
-          <w:bCs/>
-        </w:rPr>
-        <w:t>paragraph</w:t>
-      </w:r>
-      <w:proofErr w:type="spellEnd"/>
-      <w:r>
-        <w:rPr>
-          <w:bCs/>
-        </w:rPr>
-        <w:t xml:space="preserve"> </w:t>
-      </w:r>
-      <w:proofErr w:type="spellStart"/>
-      <w:r>
-        <w:rPr>
-          <w:bCs/>
-        </w:rPr>
-        <w:t>is</w:t>
-      </w:r>
-      <w:proofErr w:type="spellEnd"/>
-      <w:r>
-        <w:rPr>
-          <w:bCs/>
-        </w:rPr>
-        <w:t xml:space="preserve"> </w:t>
-      </w:r>
-      <w:proofErr w:type="spellStart"/>
-      <w:r>
-        <w:rPr>
-          <w:bCs/>
-        </w:rPr>
-        <w:t>sample</w:t>
-      </w:r>
-      <w:proofErr w:type="spellEnd"/>
-      <w:r>
-        <w:rPr>
-          <w:bCs/>
-        </w:rPr>
-        <w:t xml:space="preserve"> </w:t>
-      </w:r>
-      <w:proofErr w:type="spellStart"/>
-      <w:r>
-        <w:rPr>
-          <w:bCs/>
-        </w:rPr>
-        <w:t>text</w:t>
-      </w:r>
-      <w:proofErr w:type="spellEnd"/>
-      <w:r>
-        <w:rPr>
-          <w:bCs/>
-        </w:rPr>
-        <w:t xml:space="preserve"> </w:t>
-      </w:r>
-      <w:proofErr w:type="spellStart"/>
-      <w:r>
-        <w:rPr>
-          <w:bCs/>
-        </w:rPr>
-        <w:t>used</w:t>
-      </w:r>
-      <w:proofErr w:type="spellEnd"/>
-      <w:r>
-        <w:rPr>
-          <w:bCs/>
-        </w:rPr>
-        <w:t xml:space="preserve"> </w:t>
-      </w:r>
-      <w:proofErr w:type="spellStart"/>
-      <w:r>
-        <w:rPr>
-          <w:bCs/>
-        </w:rPr>
-        <w:t>for</w:t>
-      </w:r>
-      <w:proofErr w:type="spellEnd"/>
-      <w:r>
-        <w:rPr>
-          <w:bCs/>
-        </w:rPr>
-        <w:t xml:space="preserve"> </w:t>
-      </w:r>
-      <w:proofErr w:type="spellStart"/>
-      <w:r>
-        <w:rPr>
-          <w:bCs/>
-        </w:rPr>
-        <w:t>testing</w:t>
-      </w:r>
-      <w:proofErr w:type="spellEnd"/>
-      <w:r>
-        <w:rPr>
-          <w:bCs/>
-        </w:rPr>
-        <w:t xml:space="preserve"> </w:t>
-      </w:r>
-      <w:proofErr w:type="spellStart"/>
-      <w:r>
-        <w:rPr>
-          <w:bCs/>
-        </w:rPr>
-        <w:t>document</w:t>
-      </w:r>
-      <w:proofErr w:type="spellEnd"/>
-      <w:r>
-        <w:rPr>
-          <w:bCs/>
-        </w:rPr>
-        <w:t xml:space="preserve"> </w:t>
-      </w:r>
-      <w:proofErr w:type="spellStart"/>
-      <w:r>
-        <w:rPr>
-          <w:bCs/>
-        </w:rPr>
-        <w:t>formatting</w:t>
-      </w:r>
-      <w:proofErr w:type="spellEnd"/>
-      <w:r>
-        <w:rPr>
-          <w:bCs/>
-        </w:rPr>
-        <w:t xml:space="preserve">. The </w:t>
-      </w:r>
-      <w:proofErr w:type="spellStart"/>
-      <w:r>
-        <w:rPr>
-          <w:bCs/>
-        </w:rPr>
-        <w:t>text</w:t>
-      </w:r>
-      <w:proofErr w:type="spellEnd"/>
-      <w:r>
-        <w:rPr>
-          <w:bCs/>
-        </w:rPr>
-        <w:t xml:space="preserve"> </w:t>
-      </w:r>
-      <w:proofErr w:type="spellStart"/>
-      <w:r>
-        <w:rPr>
-          <w:bCs/>
-        </w:rPr>
-        <w:t>has</w:t>
-      </w:r>
-      <w:proofErr w:type="spellEnd"/>
-      <w:r>
-        <w:rPr>
-          <w:bCs/>
-        </w:rPr>
-        <w:t xml:space="preserve"> no </w:t>
-      </w:r>
-      <w:proofErr w:type="spellStart"/>
-      <w:r>
-        <w:rPr>
-          <w:bCs/>
-        </w:rPr>
-        <w:t>meaningful</w:t>
-      </w:r>
-      <w:proofErr w:type="spellEnd"/>
-      <w:r>
-        <w:rPr>
-          <w:bCs/>
-        </w:rPr>
-        <w:t xml:space="preserve"> </w:t>
-      </w:r>
-      <w:proofErr w:type="spellStart"/>
-      <w:r>
-        <w:rPr>
-          <w:bCs/>
-        </w:rPr>
-        <w:t>content</w:t>
-      </w:r>
-      <w:proofErr w:type="spellEnd"/>
-      <w:r>
-        <w:rPr>
-          <w:bCs/>
-        </w:rPr>
-        <w:t xml:space="preserve"> and </w:t>
-      </w:r>
-      <w:proofErr w:type="spellStart"/>
-      <w:r>
-        <w:rPr>
-          <w:bCs/>
-        </w:rPr>
-        <w:t>has</w:t>
-      </w:r>
-      <w:proofErr w:type="spellEnd"/>
-      <w:r>
-        <w:rPr>
-          <w:bCs/>
-        </w:rPr>
-        <w:t xml:space="preserve"> </w:t>
-      </w:r>
-      <w:proofErr w:type="spellStart"/>
-      <w:r>
-        <w:rPr>
-          <w:bCs/>
-        </w:rPr>
-        <w:t>been</w:t>
-      </w:r>
-      <w:proofErr w:type="spellEnd"/>
-      <w:r>
-        <w:rPr>
-          <w:bCs/>
-        </w:rPr>
-        <w:t xml:space="preserve"> </w:t>
-      </w:r>
-      <w:proofErr w:type="spellStart"/>
-      <w:r>
-        <w:rPr>
-          <w:bCs/>
-        </w:rPr>
-        <w:t>created</w:t>
-      </w:r>
-      <w:proofErr w:type="spellEnd"/>
-      <w:r>
-        <w:rPr>
-          <w:bCs/>
-        </w:rPr>
-        <w:t xml:space="preserve"> </w:t>
-      </w:r>
-      <w:proofErr w:type="spellStart"/>
-      <w:r>
-        <w:rPr>
-          <w:bCs/>
-        </w:rPr>
-        <w:t>solely</w:t>
-      </w:r>
-      <w:proofErr w:type="spellEnd"/>
-      <w:r>
-        <w:rPr>
-          <w:bCs/>
-        </w:rPr>
-        <w:t xml:space="preserve"> </w:t>
-      </w:r>
-      <w:proofErr w:type="spellStart"/>
-      <w:r>
-        <w:rPr>
-          <w:bCs/>
-        </w:rPr>
-        <w:t>for</w:t>
-      </w:r>
-      <w:proofErr w:type="spellEnd"/>
-      <w:r>
-        <w:rPr>
-          <w:bCs/>
-        </w:rPr>
-        <w:t xml:space="preserve"> </w:t>
-      </w:r>
-      <w:proofErr w:type="spellStart"/>
-      <w:r>
-        <w:rPr>
-          <w:bCs/>
-        </w:rPr>
-        <w:t>the</w:t>
-      </w:r>
-      <w:proofErr w:type="spellEnd"/>
-      <w:r>
-        <w:rPr>
-          <w:bCs/>
-        </w:rPr>
-        <w:t xml:space="preserve"> </w:t>
-      </w:r>
-      <w:proofErr w:type="spellStart"/>
-      <w:r>
-        <w:rPr>
-          <w:bCs/>
-        </w:rPr>
-        <w:t>purpose</w:t>
-      </w:r>
-      <w:proofErr w:type="spellEnd"/>
-      <w:r>
-        <w:rPr>
-          <w:bCs/>
-        </w:rPr>
-        <w:t xml:space="preserve"> of </w:t>
-      </w:r>
-      <w:proofErr w:type="spellStart"/>
-      <w:r>
-        <w:rPr>
-          <w:bCs/>
-        </w:rPr>
-        <w:t>validating</w:t>
-      </w:r>
-      <w:proofErr w:type="spellEnd"/>
-      <w:r>
-        <w:rPr>
-          <w:bCs/>
-        </w:rPr>
-        <w:t xml:space="preserve"> </w:t>
-      </w:r>
-      <w:proofErr w:type="spellStart"/>
-      <w:r>
-        <w:rPr>
-          <w:bCs/>
-        </w:rPr>
-        <w:t>formatting</w:t>
-      </w:r>
-      <w:proofErr w:type="spellEnd"/>
-      <w:r>
-        <w:rPr>
-          <w:bCs/>
-        </w:rPr>
-        <w:t xml:space="preserve"> </w:t>
-      </w:r>
-      <w:proofErr w:type="spellStart"/>
-      <w:r>
-        <w:rPr>
-          <w:bCs/>
-        </w:rPr>
-        <w:t>requirements</w:t>
-      </w:r>
-      <w:proofErr w:type="spellEnd"/>
-      <w:r>
-        <w:rPr>
-          <w:bCs/>
-        </w:rPr>
-        <w:t xml:space="preserve">. The </w:t>
-      </w:r>
-      <w:proofErr w:type="spellStart"/>
-      <w:r>
-        <w:rPr>
-          <w:bCs/>
-        </w:rPr>
-        <w:t>length</w:t>
-      </w:r>
-      <w:proofErr w:type="spellEnd"/>
-      <w:r>
-        <w:rPr>
-          <w:bCs/>
-        </w:rPr>
-        <w:t xml:space="preserve"> of </w:t>
-      </w:r>
-      <w:proofErr w:type="spellStart"/>
-      <w:r>
-        <w:rPr>
-          <w:bCs/>
-        </w:rPr>
-        <w:t>the</w:t>
-      </w:r>
-      <w:proofErr w:type="spellEnd"/>
-      <w:r>
-        <w:rPr>
-          <w:bCs/>
-        </w:rPr>
-        <w:t xml:space="preserve"> </w:t>
-      </w:r>
-      <w:proofErr w:type="spellStart"/>
-      <w:r>
-        <w:rPr>
-          <w:bCs/>
-        </w:rPr>
-        <w:t>paragraph</w:t>
-      </w:r>
-      <w:proofErr w:type="spellEnd"/>
-      <w:r>
-        <w:rPr>
-          <w:bCs/>
-        </w:rPr>
-        <w:t xml:space="preserve"> </w:t>
-      </w:r>
-      <w:proofErr w:type="spellStart"/>
-      <w:r>
-        <w:rPr>
-          <w:bCs/>
-        </w:rPr>
-        <w:t>has</w:t>
-      </w:r>
-      <w:proofErr w:type="spellEnd"/>
-      <w:r>
-        <w:rPr>
-          <w:bCs/>
-        </w:rPr>
-        <w:t xml:space="preserve"> </w:t>
-      </w:r>
-      <w:proofErr w:type="spellStart"/>
-      <w:r>
-        <w:rPr>
-          <w:bCs/>
-        </w:rPr>
-        <w:t>been</w:t>
-      </w:r>
-      <w:proofErr w:type="spellEnd"/>
-      <w:r>
-        <w:rPr>
-          <w:bCs/>
-        </w:rPr>
-        <w:t xml:space="preserve"> </w:t>
-      </w:r>
-      <w:proofErr w:type="spellStart"/>
-      <w:r>
-        <w:rPr>
-          <w:bCs/>
-        </w:rPr>
-        <w:t>chosen</w:t>
-      </w:r>
-      <w:proofErr w:type="spellEnd"/>
-      <w:r>
-        <w:rPr>
-          <w:bCs/>
-        </w:rPr>
-        <w:t xml:space="preserve"> </w:t>
-      </w:r>
-      <w:proofErr w:type="spellStart"/>
-      <w:r>
-        <w:rPr>
-          <w:bCs/>
-        </w:rPr>
-        <w:t>to</w:t>
-      </w:r>
-      <w:proofErr w:type="spellEnd"/>
-      <w:r>
-        <w:rPr>
-          <w:bCs/>
-        </w:rPr>
-        <w:t xml:space="preserve"> </w:t>
-      </w:r>
-      <w:proofErr w:type="spellStart"/>
-      <w:r>
-        <w:rPr>
-          <w:bCs/>
-        </w:rPr>
-        <w:t>correspond</w:t>
-      </w:r>
-      <w:proofErr w:type="spellEnd"/>
-      <w:r>
-        <w:rPr>
-          <w:bCs/>
-        </w:rPr>
-        <w:t xml:space="preserve"> </w:t>
-      </w:r>
-      <w:proofErr w:type="spellStart"/>
-      <w:r>
-        <w:rPr>
-          <w:bCs/>
-        </w:rPr>
-        <w:t>to</w:t>
-      </w:r>
-      <w:proofErr w:type="spellEnd"/>
-      <w:r>
-        <w:rPr>
-          <w:bCs/>
-        </w:rPr>
-        <w:t xml:space="preserve"> </w:t>
-      </w:r>
-      <w:proofErr w:type="spellStart"/>
-      <w:r>
-        <w:rPr>
-          <w:bCs/>
-        </w:rPr>
-        <w:t>the</w:t>
-      </w:r>
-      <w:proofErr w:type="spellEnd"/>
-      <w:r>
-        <w:rPr>
-          <w:bCs/>
-        </w:rPr>
-        <w:t xml:space="preserve"> </w:t>
-      </w:r>
-      <w:proofErr w:type="spellStart"/>
-      <w:r>
-        <w:rPr>
-          <w:bCs/>
-        </w:rPr>
-        <w:t>volume</w:t>
-      </w:r>
-      <w:proofErr w:type="spellEnd"/>
-      <w:r>
-        <w:rPr>
-          <w:bCs/>
-        </w:rPr>
-        <w:t xml:space="preserve"> of a </w:t>
-      </w:r>
-      <w:proofErr w:type="spellStart"/>
-      <w:r>
-        <w:rPr>
-          <w:bCs/>
-        </w:rPr>
-        <w:t>typical</w:t>
-      </w:r>
-      <w:proofErr w:type="spellEnd"/>
-      <w:r>
-        <w:rPr>
-          <w:bCs/>
-        </w:rPr>
-        <w:t xml:space="preserve"> </w:t>
-      </w:r>
-      <w:proofErr w:type="spellStart"/>
-      <w:r>
-        <w:rPr>
-          <w:bCs/>
-        </w:rPr>
-        <w:t>academic</w:t>
-      </w:r>
-      <w:proofErr w:type="spellEnd"/>
-      <w:r>
-        <w:rPr>
-          <w:bCs/>
-        </w:rPr>
-        <w:t xml:space="preserve"> </w:t>
-      </w:r>
-      <w:proofErr w:type="spellStart"/>
-      <w:r>
-        <w:rPr>
-          <w:bCs/>
-        </w:rPr>
-        <w:t>text</w:t>
-      </w:r>
-      <w:proofErr w:type="spellEnd"/>
-      <w:r>
-        <w:rPr>
-          <w:bCs/>
-        </w:rPr>
-        <w:t>.</w:t>
-      </w:r>
-    </w:p>
-    <w:p>
-      <w:pPr>
-        <w:rPr>
-          <w:bCs/>
-        </w:rPr>
-      </w:pPr>
-      <w:r>
-        <w:rPr>
-          <w:bCs/>
-        </w:rPr>
-        <w:t xml:space="preserve">The </w:t>
-      </w:r>
-      <w:proofErr w:type="spellStart"/>
-      <w:r>
-        <w:rPr>
-          <w:bCs/>
-        </w:rPr>
-        <w:t>following</w:t>
-      </w:r>
-      <w:proofErr w:type="spellEnd"/>
-      <w:r>
-        <w:rPr>
-          <w:bCs/>
-        </w:rPr>
-        <w:t xml:space="preserve"> </w:t>
-      </w:r>
-      <w:proofErr w:type="spellStart"/>
-      <w:r>
-        <w:rPr>
-          <w:bCs/>
-        </w:rPr>
-        <w:t>paragraph</w:t>
-      </w:r>
-      <w:proofErr w:type="spellEnd"/>
-      <w:r>
-        <w:rPr>
-          <w:bCs/>
-        </w:rPr>
-        <w:t xml:space="preserve"> </w:t>
-      </w:r>
-      <w:proofErr w:type="spellStart"/>
-      <w:r>
-        <w:rPr>
-          <w:bCs/>
-        </w:rPr>
-        <w:t>covers</w:t>
-      </w:r>
-      <w:proofErr w:type="spellEnd"/>
-      <w:r>
-        <w:rPr>
-          <w:bCs/>
-        </w:rPr>
-        <w:t xml:space="preserve"> </w:t>
-      </w:r>
-      <w:proofErr w:type="spellStart"/>
-      <w:r>
-        <w:rPr>
-          <w:bCs/>
-        </w:rPr>
-        <w:t>additional</w:t>
-      </w:r>
-      <w:proofErr w:type="spellEnd"/>
-      <w:r>
-        <w:rPr>
-          <w:bCs/>
-        </w:rPr>
-        <w:t xml:space="preserve"> </w:t>
-      </w:r>
-      <w:proofErr w:type="spellStart"/>
-      <w:r>
-        <w:rPr>
-          <w:bCs/>
-        </w:rPr>
-        <w:t>aspects</w:t>
-      </w:r>
-      <w:proofErr w:type="spellEnd"/>
-      <w:r>
-        <w:rPr>
-          <w:bCs/>
-        </w:rPr>
-        <w:t xml:space="preserve"> </w:t>
-      </w:r>
-      <w:proofErr w:type="spellStart"/>
-      <w:r>
-        <w:rPr>
-          <w:bCs/>
-        </w:rPr>
-        <w:t>necessary</w:t>
-      </w:r>
-      <w:proofErr w:type="spellEnd"/>
-      <w:r>
-        <w:rPr>
-          <w:bCs/>
-        </w:rPr>
-        <w:t xml:space="preserve"> </w:t>
-      </w:r>
-      <w:proofErr w:type="spellStart"/>
-      <w:r>
-        <w:rPr>
-          <w:bCs/>
-        </w:rPr>
-        <w:t>for</w:t>
-      </w:r>
-      <w:proofErr w:type="spellEnd"/>
-      <w:r>
-        <w:rPr>
-          <w:bCs/>
-        </w:rPr>
-        <w:t xml:space="preserve"> </w:t>
-      </w:r>
-      <w:proofErr w:type="spellStart"/>
-      <w:r>
-        <w:rPr>
-          <w:bCs/>
-        </w:rPr>
-        <w:t>conducting</w:t>
-      </w:r>
-      <w:proofErr w:type="spellEnd"/>
-      <w:r>
-        <w:rPr>
-          <w:bCs/>
-        </w:rPr>
-        <w:t xml:space="preserve"> </w:t>
-      </w:r>
-      <w:proofErr w:type="spellStart"/>
-      <w:r>
-        <w:rPr>
-          <w:bCs/>
-        </w:rPr>
-        <w:t>the</w:t>
-      </w:r>
-      <w:proofErr w:type="spellEnd"/>
-      <w:r>
-        <w:rPr>
-          <w:bCs/>
-        </w:rPr>
-        <w:t xml:space="preserve"> </w:t>
-      </w:r>
-      <w:proofErr w:type="spellStart"/>
-      <w:r>
-        <w:rPr>
-          <w:bCs/>
-        </w:rPr>
-        <w:t>testing</w:t>
-      </w:r>
-      <w:proofErr w:type="spellEnd"/>
-      <w:r>
-        <w:rPr>
-          <w:bCs/>
-        </w:rPr>
-        <w:t xml:space="preserve">. </w:t>
-      </w:r>
-      <w:proofErr w:type="spellStart"/>
-      <w:r>
-        <w:rPr>
-          <w:bCs/>
-        </w:rPr>
-        <w:t>Various</w:t>
-      </w:r>
-      <w:proofErr w:type="spellEnd"/>
-      <w:r>
-        <w:rPr>
-          <w:bCs/>
-        </w:rPr>
-        <w:t xml:space="preserve"> </w:t>
-      </w:r>
-      <w:proofErr w:type="spellStart"/>
-      <w:r>
-        <w:rPr>
-          <w:bCs/>
-        </w:rPr>
-        <w:t>formatting</w:t>
-      </w:r>
-      <w:proofErr w:type="spellEnd"/>
-      <w:r>
-        <w:rPr>
-          <w:bCs/>
-        </w:rPr>
-        <w:t xml:space="preserve"> </w:t>
-      </w:r>
-      <w:proofErr w:type="spellStart"/>
-      <w:r>
-        <w:rPr>
-          <w:bCs/>
-        </w:rPr>
-        <w:t>elements</w:t>
-      </w:r>
-      <w:proofErr w:type="spellEnd"/>
-      <w:r>
-        <w:rPr>
-          <w:bCs/>
-        </w:rPr>
-        <w:t xml:space="preserve">, </w:t>
-      </w:r>
-      <w:proofErr w:type="spellStart"/>
-      <w:r>
-        <w:rPr>
-          <w:bCs/>
-        </w:rPr>
-        <w:t>including</w:t>
-      </w:r>
-      <w:proofErr w:type="spellEnd"/>
-      <w:r>
-        <w:rPr>
-          <w:bCs/>
-        </w:rPr>
-        <w:t xml:space="preserve"> </w:t>
-      </w:r>
-      <w:proofErr w:type="spellStart"/>
-      <w:r>
-        <w:rPr>
-          <w:bCs/>
-        </w:rPr>
-        <w:t>headings</w:t>
-      </w:r>
-      <w:proofErr w:type="spellEnd"/>
-      <w:r>
-        <w:rPr>
-          <w:bCs/>
-        </w:rPr>
-        <w:t xml:space="preserve">, </w:t>
-      </w:r>
-      <w:proofErr w:type="spellStart"/>
-      <w:r>
-        <w:rPr>
-          <w:bCs/>
-        </w:rPr>
-        <w:t>paragraphs</w:t>
-      </w:r>
-      <w:proofErr w:type="spellEnd"/>
-      <w:r>
-        <w:rPr>
-          <w:bCs/>
-        </w:rPr>
-        <w:t xml:space="preserve"> and </w:t>
-      </w:r>
-      <w:proofErr w:type="spellStart"/>
-      <w:r>
-        <w:rPr>
-          <w:bCs/>
-        </w:rPr>
-        <w:t>tables</w:t>
-      </w:r>
-      <w:proofErr w:type="spellEnd"/>
-      <w:r>
-        <w:rPr>
-          <w:bCs/>
-        </w:rPr>
-        <w:t xml:space="preserve">, have </w:t>
-      </w:r>
-      <w:proofErr w:type="spellStart"/>
-      <w:r>
-        <w:rPr>
-          <w:bCs/>
-        </w:rPr>
-        <w:t>been</w:t>
-      </w:r>
-      <w:proofErr w:type="spellEnd"/>
-      <w:r>
-        <w:rPr>
-          <w:bCs/>
-        </w:rPr>
-        <w:t xml:space="preserve"> </w:t>
-      </w:r>
-      <w:proofErr w:type="spellStart"/>
-      <w:r>
-        <w:rPr>
-          <w:bCs/>
-        </w:rPr>
-        <w:t>placed</w:t>
-      </w:r>
-      <w:proofErr w:type="spellEnd"/>
-      <w:r>
-        <w:rPr>
-          <w:bCs/>
-        </w:rPr>
-        <w:t xml:space="preserve"> in </w:t>
-      </w:r>
-      <w:proofErr w:type="spellStart"/>
-      <w:r>
-        <w:rPr>
-          <w:bCs/>
-        </w:rPr>
-        <w:t>the</w:t>
-      </w:r>
-      <w:proofErr w:type="spellEnd"/>
-      <w:r>
-        <w:rPr>
-          <w:bCs/>
-        </w:rPr>
-        <w:t xml:space="preserve"> </w:t>
-      </w:r>
-      <w:proofErr w:type="spellStart"/>
-      <w:r>
-        <w:rPr>
-          <w:bCs/>
-        </w:rPr>
-        <w:t>document</w:t>
-      </w:r>
-      <w:proofErr w:type="spellEnd"/>
-      <w:r>
-        <w:rPr>
-          <w:bCs/>
-        </w:rPr>
-        <w:t xml:space="preserve"> in </w:t>
-      </w:r>
-      <w:proofErr w:type="spellStart"/>
-      <w:r>
-        <w:rPr>
-          <w:bCs/>
-        </w:rPr>
-        <w:t>such</w:t>
-      </w:r>
-      <w:proofErr w:type="spellEnd"/>
-      <w:r>
-        <w:rPr>
-          <w:bCs/>
-        </w:rPr>
-        <w:t xml:space="preserve"> a </w:t>
-      </w:r>
-      <w:proofErr w:type="spellStart"/>
-      <w:r>
-        <w:rPr>
-          <w:bCs/>
-        </w:rPr>
-        <w:t>way</w:t>
-      </w:r>
-      <w:proofErr w:type="spellEnd"/>
-      <w:r>
-        <w:rPr>
-          <w:bCs/>
-        </w:rPr>
-        <w:t xml:space="preserve"> </w:t>
-      </w:r>
-      <w:proofErr w:type="spellStart"/>
-      <w:r>
-        <w:rPr>
-          <w:bCs/>
-        </w:rPr>
-        <w:t>that</w:t>
-      </w:r>
-      <w:proofErr w:type="spellEnd"/>
-      <w:r>
-        <w:rPr>
-          <w:bCs/>
-        </w:rPr>
-        <w:t xml:space="preserve"> </w:t>
-      </w:r>
-      <w:proofErr w:type="spellStart"/>
-      <w:r>
-        <w:rPr>
-          <w:bCs/>
-        </w:rPr>
-        <w:t>there</w:t>
-      </w:r>
-      <w:proofErr w:type="spellEnd"/>
-      <w:r>
-        <w:rPr>
-          <w:bCs/>
-        </w:rPr>
-        <w:t xml:space="preserve"> </w:t>
-      </w:r>
-      <w:proofErr w:type="spellStart"/>
-      <w:r>
-        <w:rPr>
-          <w:bCs/>
-        </w:rPr>
-        <w:t>is</w:t>
-      </w:r>
-      <w:proofErr w:type="spellEnd"/>
-      <w:r>
-        <w:rPr>
-          <w:bCs/>
-        </w:rPr>
-        <w:t xml:space="preserve"> </w:t>
-      </w:r>
-      <w:proofErr w:type="spellStart"/>
-      <w:r>
-        <w:rPr>
-          <w:bCs/>
-        </w:rPr>
-        <w:t>sufficient</w:t>
-      </w:r>
-      <w:proofErr w:type="spellEnd"/>
-      <w:r>
-        <w:rPr>
-          <w:bCs/>
-        </w:rPr>
-        <w:t xml:space="preserve"> </w:t>
-      </w:r>
-      <w:proofErr w:type="spellStart"/>
-      <w:r>
-        <w:rPr>
-          <w:bCs/>
-        </w:rPr>
-        <w:t>material</w:t>
-      </w:r>
-      <w:proofErr w:type="spellEnd"/>
-      <w:r>
-        <w:rPr>
-          <w:bCs/>
-        </w:rPr>
-        <w:t xml:space="preserve"> </w:t>
-      </w:r>
-      <w:proofErr w:type="spellStart"/>
-      <w:r>
-        <w:rPr>
-          <w:bCs/>
-        </w:rPr>
-        <w:t>for</w:t>
-      </w:r>
-      <w:proofErr w:type="spellEnd"/>
-      <w:r>
-        <w:rPr>
-          <w:bCs/>
-        </w:rPr>
-        <w:t xml:space="preserve"> </w:t>
-      </w:r>
-      <w:proofErr w:type="spellStart"/>
-      <w:r>
-        <w:rPr>
-          <w:bCs/>
-        </w:rPr>
-        <w:t>checking</w:t>
-      </w:r>
-      <w:proofErr w:type="spellEnd"/>
-      <w:r>
-        <w:rPr>
-          <w:bCs/>
-        </w:rPr>
-        <w:t xml:space="preserve"> </w:t>
-      </w:r>
-      <w:proofErr w:type="spellStart"/>
-      <w:r>
-        <w:rPr>
-          <w:bCs/>
-        </w:rPr>
-        <w:t>validation</w:t>
-      </w:r>
-      <w:proofErr w:type="spellEnd"/>
-      <w:r>
-        <w:rPr>
-          <w:bCs/>
-        </w:rPr>
-        <w:t xml:space="preserve"> </w:t>
-      </w:r>
-      <w:proofErr w:type="spellStart"/>
-      <w:r>
-        <w:rPr>
-          <w:bCs/>
-        </w:rPr>
-        <w:t>rules</w:t>
-      </w:r>
-      <w:proofErr w:type="spellEnd"/>
-      <w:r>
-        <w:rPr>
-          <w:bCs/>
-        </w:rPr>
-        <w:t xml:space="preserve">. </w:t>
-      </w:r>
-      <w:proofErr w:type="spellStart"/>
-      <w:r>
-        <w:rPr>
-          <w:bCs/>
-        </w:rPr>
-        <w:t>During</w:t>
-      </w:r>
-      <w:proofErr w:type="spellEnd"/>
-      <w:r>
-        <w:rPr>
-          <w:bCs/>
-        </w:rPr>
-        <w:t xml:space="preserve"> </w:t>
-      </w:r>
-      <w:proofErr w:type="spellStart"/>
-      <w:r>
-        <w:rPr>
-          <w:bCs/>
-        </w:rPr>
-        <w:t>testing</w:t>
-      </w:r>
-      <w:proofErr w:type="spellEnd"/>
-      <w:r>
-        <w:rPr>
-          <w:bCs/>
-        </w:rPr>
-        <w:t xml:space="preserve">, </w:t>
-      </w:r>
-      <w:proofErr w:type="spellStart"/>
-      <w:r>
-        <w:rPr>
-          <w:bCs/>
-        </w:rPr>
-        <w:t>both</w:t>
-      </w:r>
-      <w:proofErr w:type="spellEnd"/>
-      <w:r>
-        <w:rPr>
-          <w:bCs/>
-        </w:rPr>
-        <w:t xml:space="preserve"> </w:t>
-      </w:r>
-      <w:proofErr w:type="spellStart"/>
-      <w:r>
-        <w:rPr>
-          <w:bCs/>
-        </w:rPr>
-        <w:t>formatting</w:t>
-      </w:r>
-      <w:proofErr w:type="spellEnd"/>
-      <w:r>
-        <w:rPr>
-          <w:bCs/>
-        </w:rPr>
-        <w:t xml:space="preserve"> and </w:t>
-      </w:r>
-      <w:proofErr w:type="spellStart"/>
-      <w:r>
-        <w:rPr>
-          <w:bCs/>
-        </w:rPr>
-        <w:t>structural</w:t>
-      </w:r>
-      <w:proofErr w:type="spellEnd"/>
-      <w:r>
-        <w:rPr>
-          <w:bCs/>
-        </w:rPr>
-        <w:t xml:space="preserve"> </w:t>
-      </w:r>
-      <w:proofErr w:type="spellStart"/>
-      <w:r>
-        <w:rPr>
-          <w:bCs/>
-        </w:rPr>
-        <w:t>compliance</w:t>
-      </w:r>
-      <w:proofErr w:type="spellEnd"/>
-      <w:r>
-        <w:rPr>
-          <w:bCs/>
-        </w:rPr>
-        <w:t xml:space="preserve"> </w:t>
-      </w:r>
-      <w:proofErr w:type="spellStart"/>
-      <w:r>
-        <w:rPr>
-          <w:bCs/>
-        </w:rPr>
-        <w:t>with</w:t>
-      </w:r>
-      <w:proofErr w:type="spellEnd"/>
-      <w:r>
-        <w:rPr>
-          <w:bCs/>
-        </w:rPr>
-        <w:t xml:space="preserve"> </w:t>
-      </w:r>
-      <w:proofErr w:type="spellStart"/>
-      <w:r>
-        <w:rPr>
-          <w:bCs/>
-        </w:rPr>
-        <w:t>the</w:t>
-      </w:r>
-      <w:proofErr w:type="spellEnd"/>
-      <w:r>
-        <w:rPr>
-          <w:bCs/>
-        </w:rPr>
-        <w:t xml:space="preserve"> </w:t>
-      </w:r>
-      <w:proofErr w:type="spellStart"/>
-      <w:r>
-        <w:rPr>
-          <w:bCs/>
-        </w:rPr>
-        <w:t>requirements</w:t>
-      </w:r>
-      <w:proofErr w:type="spellEnd"/>
-      <w:r>
-        <w:rPr>
-          <w:bCs/>
-        </w:rPr>
-        <w:t xml:space="preserve"> are </w:t>
-      </w:r>
-      <w:proofErr w:type="spellStart"/>
-      <w:r>
-        <w:rPr>
-          <w:bCs/>
-        </w:rPr>
-        <w:t>verified</w:t>
-      </w:r>
-      <w:proofErr w:type="spellEnd"/>
-      <w:r>
-        <w:rPr>
-          <w:bCs/>
-        </w:rPr>
-        <w:t>.</w:t>
-      </w:r>
-    </w:p>
-    <w:p>
-      <w:pPr>
-        <w:rPr>
-          <w:bCs/>
-        </w:rPr>
-      </w:pPr>
-      <w:proofErr w:type="spellStart"/>
-      <w:r>
-        <w:rPr>
-          <w:bCs/>
-        </w:rPr>
-        <w:t>This</w:t>
-      </w:r>
-      <w:proofErr w:type="spellEnd"/>
-      <w:r>
-        <w:rPr>
-          <w:bCs/>
-        </w:rPr>
-        <w:t xml:space="preserve"> </w:t>
-      </w:r>
-      <w:proofErr w:type="spellStart"/>
-      <w:r>
-        <w:rPr>
-          <w:bCs/>
-        </w:rPr>
-        <w:t>paragraph</w:t>
-      </w:r>
-      <w:proofErr w:type="spellEnd"/>
-      <w:r>
-        <w:rPr>
-          <w:bCs/>
-        </w:rPr>
-        <w:t xml:space="preserve"> </w:t>
-      </w:r>
-      <w:proofErr w:type="spellStart"/>
-      <w:r>
-        <w:rPr>
-          <w:bCs/>
-        </w:rPr>
-        <w:t>is</w:t>
-      </w:r>
-      <w:proofErr w:type="spellEnd"/>
-      <w:r>
-        <w:rPr>
-          <w:bCs/>
-        </w:rPr>
-        <w:t xml:space="preserve"> </w:t>
-      </w:r>
-      <w:proofErr w:type="spellStart"/>
-      <w:r>
-        <w:rPr>
-          <w:bCs/>
-        </w:rPr>
-        <w:t>sample</w:t>
-      </w:r>
-      <w:proofErr w:type="spellEnd"/>
-      <w:r>
-        <w:rPr>
-          <w:bCs/>
-        </w:rPr>
-        <w:t xml:space="preserve"> </w:t>
-      </w:r>
-      <w:proofErr w:type="spellStart"/>
-      <w:r>
-        <w:rPr>
-          <w:bCs/>
-        </w:rPr>
-        <w:t>text</w:t>
-      </w:r>
-      <w:proofErr w:type="spellEnd"/>
-      <w:r>
-        <w:rPr>
-          <w:bCs/>
-        </w:rPr>
-        <w:t xml:space="preserve"> </w:t>
-      </w:r>
-      <w:proofErr w:type="spellStart"/>
-      <w:r>
-        <w:rPr>
-          <w:bCs/>
-        </w:rPr>
-        <w:t>used</w:t>
-      </w:r>
-      <w:proofErr w:type="spellEnd"/>
-      <w:r>
-        <w:rPr>
-          <w:bCs/>
-        </w:rPr>
-        <w:t xml:space="preserve"> </w:t>
-      </w:r>
-      <w:proofErr w:type="spellStart"/>
-      <w:r>
-        <w:rPr>
-          <w:bCs/>
-        </w:rPr>
-        <w:t>for</w:t>
-      </w:r>
-      <w:proofErr w:type="spellEnd"/>
-      <w:r>
-        <w:rPr>
-          <w:bCs/>
-        </w:rPr>
-        <w:t xml:space="preserve"> </w:t>
-      </w:r>
-      <w:proofErr w:type="spellStart"/>
-      <w:r>
-        <w:rPr>
-          <w:bCs/>
-        </w:rPr>
-        <w:t>testing</w:t>
-      </w:r>
-      <w:proofErr w:type="spellEnd"/>
-      <w:r>
-        <w:rPr>
-          <w:bCs/>
-        </w:rPr>
-        <w:t xml:space="preserve"> </w:t>
-      </w:r>
-      <w:proofErr w:type="spellStart"/>
-      <w:r>
-        <w:rPr>
-          <w:bCs/>
-        </w:rPr>
-        <w:t>document</w:t>
-      </w:r>
-      <w:proofErr w:type="spellEnd"/>
-      <w:r>
-        <w:rPr>
-          <w:bCs/>
-        </w:rPr>
-        <w:t xml:space="preserve"> </w:t>
-      </w:r>
-      <w:proofErr w:type="spellStart"/>
-      <w:r>
-        <w:rPr>
-          <w:bCs/>
-        </w:rPr>
-        <w:t>formatting</w:t>
-      </w:r>
-      <w:proofErr w:type="spellEnd"/>
-      <w:r>
-        <w:rPr>
-          <w:bCs/>
-        </w:rPr>
-        <w:t xml:space="preserve">. The </w:t>
-      </w:r>
-      <w:proofErr w:type="spellStart"/>
-      <w:r>
-        <w:rPr>
-          <w:bCs/>
-        </w:rPr>
-        <w:t>text</w:t>
-      </w:r>
-      <w:proofErr w:type="spellEnd"/>
-      <w:r>
-        <w:rPr>
-          <w:bCs/>
-        </w:rPr>
-        <w:t xml:space="preserve"> </w:t>
-      </w:r>
-      <w:proofErr w:type="spellStart"/>
-      <w:r>
-        <w:rPr>
-          <w:bCs/>
-        </w:rPr>
-        <w:t>has</w:t>
-      </w:r>
-      <w:proofErr w:type="spellEnd"/>
-      <w:r>
-        <w:rPr>
-          <w:bCs/>
-        </w:rPr>
-        <w:t xml:space="preserve"> no </w:t>
-      </w:r>
-      <w:proofErr w:type="spellStart"/>
-      <w:r>
-        <w:rPr>
-          <w:bCs/>
-        </w:rPr>
-        <w:t>meaningful</w:t>
-      </w:r>
-      <w:proofErr w:type="spellEnd"/>
-      <w:r>
-        <w:rPr>
-          <w:bCs/>
-        </w:rPr>
-        <w:t xml:space="preserve"> </w:t>
-      </w:r>
-      <w:proofErr w:type="spellStart"/>
-      <w:r>
-        <w:rPr>
-          <w:bCs/>
-        </w:rPr>
-        <w:t>content</w:t>
-      </w:r>
-      <w:proofErr w:type="spellEnd"/>
-      <w:r>
-        <w:rPr>
-          <w:bCs/>
-        </w:rPr>
-        <w:t xml:space="preserve"> and </w:t>
-      </w:r>
-      <w:proofErr w:type="spellStart"/>
-      <w:r>
-        <w:rPr>
-          <w:bCs/>
-        </w:rPr>
-        <w:t>has</w:t>
-      </w:r>
-      <w:proofErr w:type="spellEnd"/>
-      <w:r>
-        <w:rPr>
-          <w:bCs/>
-        </w:rPr>
-        <w:t xml:space="preserve"> </w:t>
-      </w:r>
-      <w:proofErr w:type="spellStart"/>
-      <w:r>
-        <w:rPr>
-          <w:bCs/>
-        </w:rPr>
-        <w:t>been</w:t>
-      </w:r>
-      <w:proofErr w:type="spellEnd"/>
-      <w:r>
-        <w:rPr>
-          <w:bCs/>
-        </w:rPr>
-        <w:t xml:space="preserve"> </w:t>
-      </w:r>
-      <w:proofErr w:type="spellStart"/>
-      <w:r>
-        <w:rPr>
-          <w:bCs/>
-        </w:rPr>
-        <w:t>created</w:t>
-      </w:r>
-      <w:proofErr w:type="spellEnd"/>
-      <w:r>
-        <w:rPr>
-          <w:bCs/>
-        </w:rPr>
-        <w:t xml:space="preserve"> </w:t>
-      </w:r>
-      <w:proofErr w:type="spellStart"/>
-      <w:r>
-        <w:rPr>
-          <w:bCs/>
-        </w:rPr>
-        <w:t>solely</w:t>
-      </w:r>
-      <w:proofErr w:type="spellEnd"/>
-      <w:r>
-        <w:rPr>
-          <w:bCs/>
-        </w:rPr>
-        <w:t xml:space="preserve"> </w:t>
-      </w:r>
-      <w:proofErr w:type="spellStart"/>
-      <w:r>
-        <w:rPr>
-          <w:bCs/>
-        </w:rPr>
-        <w:t>for</w:t>
-      </w:r>
-      <w:proofErr w:type="spellEnd"/>
-      <w:r>
-        <w:rPr>
-          <w:bCs/>
-        </w:rPr>
-        <w:t xml:space="preserve"> </w:t>
-      </w:r>
-      <w:proofErr w:type="spellStart"/>
-      <w:r>
-        <w:rPr>
-          <w:bCs/>
-        </w:rPr>
-        <w:t>the</w:t>
-      </w:r>
-      <w:proofErr w:type="spellEnd"/>
-      <w:r>
-        <w:rPr>
-          <w:bCs/>
-        </w:rPr>
-        <w:t xml:space="preserve"> </w:t>
-      </w:r>
-      <w:proofErr w:type="spellStart"/>
-      <w:r>
-        <w:rPr>
-          <w:bCs/>
-        </w:rPr>
-        <w:t>purpose</w:t>
-      </w:r>
-      <w:proofErr w:type="spellEnd"/>
-      <w:r>
-        <w:rPr>
-          <w:bCs/>
-        </w:rPr>
-        <w:t xml:space="preserve"> of </w:t>
-      </w:r>
-      <w:proofErr w:type="spellStart"/>
-      <w:r>
-        <w:rPr>
-          <w:bCs/>
-        </w:rPr>
-        <w:t>validating</w:t>
-      </w:r>
-      <w:proofErr w:type="spellEnd"/>
-      <w:r>
-        <w:rPr>
-          <w:bCs/>
-        </w:rPr>
-        <w:t xml:space="preserve"> </w:t>
-      </w:r>
-      <w:proofErr w:type="spellStart"/>
-      <w:r>
-        <w:rPr>
-          <w:bCs/>
-        </w:rPr>
-        <w:t>formatting</w:t>
-      </w:r>
-      <w:proofErr w:type="spellEnd"/>
-      <w:r>
-        <w:rPr>
-          <w:bCs/>
-        </w:rPr>
-        <w:t xml:space="preserve"> </w:t>
-      </w:r>
-      <w:proofErr w:type="spellStart"/>
-      <w:r>
-        <w:rPr>
-          <w:bCs/>
-        </w:rPr>
-        <w:t>requirements</w:t>
-      </w:r>
-      <w:proofErr w:type="spellEnd"/>
-      <w:r>
-        <w:rPr>
-          <w:bCs/>
-        </w:rPr>
-        <w:t xml:space="preserve">. The </w:t>
-      </w:r>
-      <w:proofErr w:type="spellStart"/>
-      <w:r>
-        <w:rPr>
-          <w:bCs/>
-        </w:rPr>
-        <w:t>length</w:t>
-      </w:r>
-      <w:proofErr w:type="spellEnd"/>
-      <w:r>
-        <w:rPr>
-          <w:bCs/>
-        </w:rPr>
-        <w:t xml:space="preserve"> of </w:t>
-      </w:r>
-      <w:proofErr w:type="spellStart"/>
-      <w:r>
-        <w:rPr>
-          <w:bCs/>
-        </w:rPr>
-        <w:t>the</w:t>
-      </w:r>
-      <w:proofErr w:type="spellEnd"/>
-      <w:r>
-        <w:rPr>
-          <w:bCs/>
-        </w:rPr>
-        <w:t xml:space="preserve"> </w:t>
-      </w:r>
-      <w:proofErr w:type="spellStart"/>
-      <w:r>
-        <w:rPr>
-          <w:bCs/>
-        </w:rPr>
-        <w:t>paragraph</w:t>
-      </w:r>
-      <w:proofErr w:type="spellEnd"/>
-      <w:r>
-        <w:rPr>
-          <w:bCs/>
-        </w:rPr>
-        <w:t xml:space="preserve"> </w:t>
-      </w:r>
-      <w:proofErr w:type="spellStart"/>
-      <w:r>
-        <w:rPr>
-          <w:bCs/>
-        </w:rPr>
-        <w:t>has</w:t>
-      </w:r>
-      <w:proofErr w:type="spellEnd"/>
-      <w:r>
-        <w:rPr>
-          <w:bCs/>
-        </w:rPr>
-        <w:t xml:space="preserve"> </w:t>
-      </w:r>
-      <w:proofErr w:type="spellStart"/>
-      <w:r>
-        <w:rPr>
-          <w:bCs/>
-        </w:rPr>
-        <w:t>been</w:t>
-      </w:r>
-      <w:proofErr w:type="spellEnd"/>
-      <w:r>
-        <w:rPr>
-          <w:bCs/>
-        </w:rPr>
-        <w:t xml:space="preserve"> </w:t>
-      </w:r>
-      <w:proofErr w:type="spellStart"/>
-      <w:r>
-        <w:rPr>
-          <w:bCs/>
-        </w:rPr>
-        <w:t>chosen</w:t>
-      </w:r>
-      <w:proofErr w:type="spellEnd"/>
-      <w:r>
-        <w:rPr>
-          <w:bCs/>
-        </w:rPr>
-        <w:t xml:space="preserve"> </w:t>
-      </w:r>
-      <w:proofErr w:type="spellStart"/>
-      <w:r>
-        <w:rPr>
-          <w:bCs/>
-        </w:rPr>
-        <w:t>to</w:t>
-      </w:r>
-      <w:proofErr w:type="spellEnd"/>
-      <w:r>
-        <w:rPr>
-          <w:bCs/>
-        </w:rPr>
-        <w:t xml:space="preserve"> </w:t>
-      </w:r>
-      <w:proofErr w:type="spellStart"/>
-      <w:r>
-        <w:rPr>
-          <w:bCs/>
-        </w:rPr>
-        <w:t>correspond</w:t>
-      </w:r>
-      <w:proofErr w:type="spellEnd"/>
-      <w:r>
-        <w:rPr>
-          <w:bCs/>
-        </w:rPr>
-        <w:t xml:space="preserve"> </w:t>
-      </w:r>
-      <w:proofErr w:type="spellStart"/>
-      <w:r>
-        <w:rPr>
-          <w:bCs/>
-        </w:rPr>
-        <w:t>to</w:t>
-      </w:r>
-      <w:proofErr w:type="spellEnd"/>
-      <w:r>
-        <w:rPr>
-          <w:bCs/>
-        </w:rPr>
-        <w:t xml:space="preserve"> </w:t>
-      </w:r>
-      <w:proofErr w:type="spellStart"/>
-      <w:r>
-        <w:rPr>
-          <w:bCs/>
-        </w:rPr>
-        <w:t>the</w:t>
-      </w:r>
-      <w:proofErr w:type="spellEnd"/>
-      <w:r>
-        <w:rPr>
-          <w:bCs/>
-        </w:rPr>
-        <w:t xml:space="preserve"> </w:t>
-      </w:r>
-      <w:proofErr w:type="spellStart"/>
-      <w:r>
-        <w:rPr>
-          <w:bCs/>
-        </w:rPr>
-        <w:t>volume</w:t>
-      </w:r>
-      <w:proofErr w:type="spellEnd"/>
-      <w:r>
-        <w:rPr>
-          <w:bCs/>
-        </w:rPr>
-        <w:t xml:space="preserve"> of a </w:t>
-      </w:r>
-      <w:proofErr w:type="spellStart"/>
-      <w:r>
-        <w:rPr>
-          <w:bCs/>
-        </w:rPr>
-        <w:t>typical</w:t>
-      </w:r>
-      <w:proofErr w:type="spellEnd"/>
-      <w:r>
-        <w:rPr>
-          <w:bCs/>
-        </w:rPr>
-        <w:t xml:space="preserve"> </w:t>
-      </w:r>
-      <w:proofErr w:type="spellStart"/>
-      <w:r>
-        <w:rPr>
-          <w:bCs/>
-        </w:rPr>
-        <w:t>academic</w:t>
-      </w:r>
-      <w:proofErr w:type="spellEnd"/>
-      <w:r>
-        <w:rPr>
-          <w:bCs/>
-        </w:rPr>
-        <w:t xml:space="preserve"> </w:t>
-      </w:r>
-      <w:proofErr w:type="spellStart"/>
-      <w:r>
-        <w:rPr>
-          <w:bCs/>
-        </w:rPr>
-        <w:t>text</w:t>
-      </w:r>
-      <w:proofErr w:type="spellEnd"/>
-      <w:r>
-        <w:rPr>
-          <w:bCs/>
-        </w:rPr>
-        <w:t>.</w:t>
-      </w:r>
-    </w:p>
-    <w:p>
-      <w:pPr>
-        <w:rPr>
-          <w:bCs/>
-        </w:rPr>
-      </w:pPr>
-      <w:r>
-        <w:rPr>
-          <w:bCs/>
-        </w:rPr>
-        <w:t xml:space="preserve">The </w:t>
-      </w:r>
-      <w:proofErr w:type="spellStart"/>
-      <w:r>
-        <w:rPr>
-          <w:bCs/>
-        </w:rPr>
-        <w:t>following</w:t>
-      </w:r>
-      <w:proofErr w:type="spellEnd"/>
-      <w:r>
-        <w:rPr>
-          <w:bCs/>
-        </w:rPr>
-        <w:t xml:space="preserve"> </w:t>
-      </w:r>
-      <w:proofErr w:type="spellStart"/>
-      <w:r>
-        <w:rPr>
-          <w:bCs/>
-        </w:rPr>
-        <w:t>paragraph</w:t>
-      </w:r>
-      <w:proofErr w:type="spellEnd"/>
-      <w:r>
-        <w:rPr>
-          <w:bCs/>
-        </w:rPr>
-        <w:t xml:space="preserve"> </w:t>
-      </w:r>
-      <w:proofErr w:type="spellStart"/>
-      <w:r>
-        <w:rPr>
-          <w:bCs/>
-        </w:rPr>
-        <w:t>covers</w:t>
-      </w:r>
-      <w:proofErr w:type="spellEnd"/>
-      <w:r>
-        <w:rPr>
-          <w:bCs/>
-        </w:rPr>
-        <w:t xml:space="preserve"> </w:t>
-      </w:r>
-      <w:proofErr w:type="spellStart"/>
-      <w:r>
-        <w:rPr>
-          <w:bCs/>
-        </w:rPr>
-        <w:t>additional</w:t>
-      </w:r>
-      <w:proofErr w:type="spellEnd"/>
-      <w:r>
-        <w:rPr>
-          <w:bCs/>
-        </w:rPr>
-        <w:t xml:space="preserve"> </w:t>
-      </w:r>
-      <w:proofErr w:type="spellStart"/>
-      <w:r>
-        <w:rPr>
-          <w:bCs/>
-        </w:rPr>
-        <w:t>aspects</w:t>
-      </w:r>
-      <w:proofErr w:type="spellEnd"/>
-      <w:r>
-        <w:rPr>
-          <w:bCs/>
-        </w:rPr>
-        <w:t xml:space="preserve"> </w:t>
-      </w:r>
-      <w:proofErr w:type="spellStart"/>
-      <w:r>
-        <w:rPr>
-          <w:bCs/>
-        </w:rPr>
-        <w:t>necessary</w:t>
-      </w:r>
-      <w:proofErr w:type="spellEnd"/>
-      <w:r>
-        <w:rPr>
-          <w:bCs/>
-        </w:rPr>
-        <w:t xml:space="preserve"> </w:t>
-      </w:r>
-      <w:proofErr w:type="spellStart"/>
-      <w:r>
-        <w:rPr>
-          <w:bCs/>
-        </w:rPr>
-        <w:t>for</w:t>
-      </w:r>
-      <w:proofErr w:type="spellEnd"/>
-      <w:r>
-        <w:rPr>
-          <w:bCs/>
-        </w:rPr>
-        <w:t xml:space="preserve"> </w:t>
-      </w:r>
-      <w:proofErr w:type="spellStart"/>
-      <w:r>
-        <w:rPr>
-          <w:bCs/>
-        </w:rPr>
-        <w:t>conducting</w:t>
-      </w:r>
-      <w:proofErr w:type="spellEnd"/>
-      <w:r>
-        <w:rPr>
-          <w:bCs/>
-        </w:rPr>
-        <w:t xml:space="preserve"> </w:t>
-      </w:r>
-      <w:proofErr w:type="spellStart"/>
-      <w:r>
-        <w:rPr>
-          <w:bCs/>
-        </w:rPr>
-        <w:t>the</w:t>
-      </w:r>
-      <w:proofErr w:type="spellEnd"/>
-      <w:r>
-        <w:rPr>
-          <w:bCs/>
-        </w:rPr>
-        <w:t xml:space="preserve"> </w:t>
-      </w:r>
-      <w:proofErr w:type="spellStart"/>
-      <w:r>
-        <w:rPr>
-          <w:bCs/>
-        </w:rPr>
-        <w:t>testing</w:t>
-      </w:r>
-      <w:proofErr w:type="spellEnd"/>
-      <w:r>
-        <w:rPr>
-          <w:bCs/>
-        </w:rPr>
-        <w:t xml:space="preserve">. </w:t>
-      </w:r>
-      <w:proofErr w:type="spellStart"/>
-      <w:r>
-        <w:rPr>
-          <w:bCs/>
-        </w:rPr>
-        <w:t>Various</w:t>
-      </w:r>
-      <w:proofErr w:type="spellEnd"/>
-      <w:r>
-        <w:rPr>
-          <w:bCs/>
-        </w:rPr>
-        <w:t xml:space="preserve"> </w:t>
-      </w:r>
-      <w:proofErr w:type="spellStart"/>
-      <w:r>
-        <w:rPr>
-          <w:bCs/>
-        </w:rPr>
-        <w:t>formatting</w:t>
-      </w:r>
-      <w:proofErr w:type="spellEnd"/>
-      <w:r>
-        <w:rPr>
-          <w:bCs/>
-        </w:rPr>
-        <w:t xml:space="preserve"> </w:t>
-      </w:r>
-      <w:proofErr w:type="spellStart"/>
-      <w:r>
-        <w:rPr>
-          <w:bCs/>
-        </w:rPr>
-        <w:t>elements</w:t>
-      </w:r>
-      <w:proofErr w:type="spellEnd"/>
-      <w:r>
-        <w:rPr>
-          <w:bCs/>
-        </w:rPr>
-        <w:t xml:space="preserve">, </w:t>
-      </w:r>
-      <w:proofErr w:type="spellStart"/>
-      <w:r>
-        <w:rPr>
-          <w:bCs/>
-        </w:rPr>
-        <w:t>including</w:t>
-      </w:r>
-      <w:proofErr w:type="spellEnd"/>
-      <w:r>
-        <w:rPr>
-          <w:bCs/>
-        </w:rPr>
-        <w:t xml:space="preserve"> </w:t>
-      </w:r>
-      <w:proofErr w:type="spellStart"/>
-      <w:r>
-        <w:rPr>
-          <w:bCs/>
-        </w:rPr>
-        <w:t>headings</w:t>
-      </w:r>
-      <w:proofErr w:type="spellEnd"/>
-      <w:r>
-        <w:rPr>
-          <w:bCs/>
-        </w:rPr>
-        <w:t xml:space="preserve">, </w:t>
-      </w:r>
-      <w:proofErr w:type="spellStart"/>
-      <w:r>
-        <w:rPr>
-          <w:bCs/>
-        </w:rPr>
-        <w:t>paragraphs</w:t>
-      </w:r>
-      <w:proofErr w:type="spellEnd"/>
-      <w:r>
-        <w:rPr>
-          <w:bCs/>
-        </w:rPr>
-        <w:t xml:space="preserve"> and </w:t>
-      </w:r>
-      <w:proofErr w:type="spellStart"/>
-      <w:r>
-        <w:rPr>
-          <w:bCs/>
-        </w:rPr>
-        <w:t>tables</w:t>
-      </w:r>
-      <w:proofErr w:type="spellEnd"/>
-      <w:r>
-        <w:rPr>
-          <w:bCs/>
-        </w:rPr>
-        <w:t xml:space="preserve">, have </w:t>
-      </w:r>
-      <w:proofErr w:type="spellStart"/>
-      <w:r>
-        <w:rPr>
-          <w:bCs/>
-        </w:rPr>
-        <w:t>been</w:t>
-      </w:r>
-      <w:proofErr w:type="spellEnd"/>
-      <w:r>
-        <w:rPr>
-          <w:bCs/>
-        </w:rPr>
-        <w:t xml:space="preserve"> </w:t>
-      </w:r>
-      <w:proofErr w:type="spellStart"/>
-      <w:r>
-        <w:rPr>
-          <w:bCs/>
-        </w:rPr>
-        <w:t>placed</w:t>
-      </w:r>
-      <w:proofErr w:type="spellEnd"/>
-      <w:r>
-        <w:rPr>
-          <w:bCs/>
-        </w:rPr>
-        <w:t xml:space="preserve"> in </w:t>
-      </w:r>
-      <w:proofErr w:type="spellStart"/>
-      <w:r>
-        <w:rPr>
-          <w:bCs/>
-        </w:rPr>
-        <w:t>the</w:t>
-      </w:r>
-      <w:proofErr w:type="spellEnd"/>
-      <w:r>
-        <w:rPr>
-          <w:bCs/>
-        </w:rPr>
-        <w:t xml:space="preserve"> </w:t>
-      </w:r>
-      <w:proofErr w:type="spellStart"/>
-      <w:r>
-        <w:rPr>
-          <w:bCs/>
-        </w:rPr>
-        <w:t>document</w:t>
-      </w:r>
-      <w:proofErr w:type="spellEnd"/>
-      <w:r>
-        <w:rPr>
-          <w:bCs/>
-        </w:rPr>
-        <w:t xml:space="preserve"> in </w:t>
-      </w:r>
-      <w:proofErr w:type="spellStart"/>
-      <w:r>
-        <w:rPr>
-          <w:bCs/>
-        </w:rPr>
-        <w:t>such</w:t>
-      </w:r>
-      <w:proofErr w:type="spellEnd"/>
-      <w:r>
-        <w:rPr>
-          <w:bCs/>
-        </w:rPr>
-        <w:t xml:space="preserve"> a </w:t>
-      </w:r>
-      <w:proofErr w:type="spellStart"/>
-      <w:r>
-        <w:rPr>
-          <w:bCs/>
-        </w:rPr>
-        <w:t>way</w:t>
-      </w:r>
-      <w:proofErr w:type="spellEnd"/>
-      <w:r>
-        <w:rPr>
-          <w:bCs/>
-        </w:rPr>
-        <w:t xml:space="preserve"> </w:t>
-      </w:r>
-      <w:proofErr w:type="spellStart"/>
-      <w:r>
-        <w:rPr>
-          <w:bCs/>
-        </w:rPr>
-        <w:t>that</w:t>
-      </w:r>
-      <w:proofErr w:type="spellEnd"/>
-      <w:r>
-        <w:rPr>
-          <w:bCs/>
-        </w:rPr>
-        <w:t xml:space="preserve"> </w:t>
-      </w:r>
-      <w:proofErr w:type="spellStart"/>
-      <w:r>
-        <w:rPr>
-          <w:bCs/>
-        </w:rPr>
-        <w:t>there</w:t>
-      </w:r>
-      <w:proofErr w:type="spellEnd"/>
-      <w:r>
-        <w:rPr>
-          <w:bCs/>
-        </w:rPr>
-        <w:t xml:space="preserve"> </w:t>
-      </w:r>
-      <w:proofErr w:type="spellStart"/>
-      <w:r>
-        <w:rPr>
-          <w:bCs/>
-        </w:rPr>
-        <w:t>is</w:t>
-      </w:r>
-      <w:proofErr w:type="spellEnd"/>
-      <w:r>
-        <w:rPr>
-          <w:bCs/>
-        </w:rPr>
-        <w:t xml:space="preserve"> </w:t>
-      </w:r>
-      <w:proofErr w:type="spellStart"/>
-      <w:r>
-        <w:rPr>
-          <w:bCs/>
-        </w:rPr>
-        <w:t>sufficient</w:t>
-      </w:r>
-      <w:proofErr w:type="spellEnd"/>
-      <w:r>
-        <w:rPr>
-          <w:bCs/>
-        </w:rPr>
-        <w:t xml:space="preserve"> </w:t>
-      </w:r>
-      <w:proofErr w:type="spellStart"/>
-      <w:r>
-        <w:rPr>
-          <w:bCs/>
-        </w:rPr>
-        <w:t>material</w:t>
-      </w:r>
-      <w:proofErr w:type="spellEnd"/>
-      <w:r>
-        <w:rPr>
-          <w:bCs/>
-        </w:rPr>
-        <w:t xml:space="preserve"> </w:t>
-      </w:r>
-      <w:proofErr w:type="spellStart"/>
-      <w:r>
-        <w:rPr>
-          <w:bCs/>
-        </w:rPr>
-        <w:t>for</w:t>
-      </w:r>
-      <w:proofErr w:type="spellEnd"/>
-      <w:r>
-        <w:rPr>
-          <w:bCs/>
-        </w:rPr>
-        <w:t xml:space="preserve"> </w:t>
-      </w:r>
-      <w:proofErr w:type="spellStart"/>
-      <w:r>
-        <w:rPr>
-          <w:bCs/>
-        </w:rPr>
-        <w:t>checking</w:t>
-      </w:r>
-      <w:proofErr w:type="spellEnd"/>
-      <w:r>
-        <w:rPr>
-          <w:bCs/>
-        </w:rPr>
-        <w:t xml:space="preserve"> </w:t>
-      </w:r>
-      <w:proofErr w:type="spellStart"/>
-      <w:r>
-        <w:rPr>
-          <w:bCs/>
-        </w:rPr>
-        <w:t>validation</w:t>
-      </w:r>
-      <w:proofErr w:type="spellEnd"/>
-      <w:r>
-        <w:rPr>
-          <w:bCs/>
-        </w:rPr>
-        <w:t xml:space="preserve"> </w:t>
-      </w:r>
-      <w:proofErr w:type="spellStart"/>
-      <w:r>
-        <w:rPr>
-          <w:bCs/>
-        </w:rPr>
-        <w:t>rules</w:t>
-      </w:r>
-      <w:proofErr w:type="spellEnd"/>
-      <w:r>
-        <w:rPr>
-          <w:bCs/>
-        </w:rPr>
-        <w:t xml:space="preserve">. </w:t>
-      </w:r>
-      <w:proofErr w:type="spellStart"/>
-      <w:r>
-        <w:rPr>
-          <w:bCs/>
-        </w:rPr>
-        <w:t>During</w:t>
-      </w:r>
-      <w:proofErr w:type="spellEnd"/>
-      <w:r>
-        <w:rPr>
-          <w:bCs/>
-        </w:rPr>
-        <w:t xml:space="preserve"> </w:t>
-      </w:r>
-      <w:proofErr w:type="spellStart"/>
-      <w:r>
-        <w:rPr>
-          <w:bCs/>
-        </w:rPr>
-        <w:t>testing</w:t>
-      </w:r>
-      <w:proofErr w:type="spellEnd"/>
-      <w:r>
-        <w:rPr>
-          <w:bCs/>
-        </w:rPr>
-        <w:t xml:space="preserve">, </w:t>
-      </w:r>
-      <w:proofErr w:type="spellStart"/>
-      <w:r>
-        <w:rPr>
-          <w:bCs/>
-        </w:rPr>
-        <w:t>both</w:t>
-      </w:r>
-      <w:proofErr w:type="spellEnd"/>
-      <w:r>
-        <w:rPr>
-          <w:bCs/>
-        </w:rPr>
-        <w:t xml:space="preserve"> </w:t>
-      </w:r>
-      <w:proofErr w:type="spellStart"/>
-      <w:r>
-        <w:rPr>
-          <w:bCs/>
-        </w:rPr>
-        <w:t>formatting</w:t>
-      </w:r>
-      <w:proofErr w:type="spellEnd"/>
-      <w:r>
-        <w:rPr>
-          <w:bCs/>
-        </w:rPr>
-        <w:t xml:space="preserve"> and </w:t>
-      </w:r>
-      <w:proofErr w:type="spellStart"/>
-      <w:r>
-        <w:rPr>
-          <w:bCs/>
-        </w:rPr>
-        <w:t>structural</w:t>
-      </w:r>
-      <w:proofErr w:type="spellEnd"/>
-      <w:r>
-        <w:rPr>
-          <w:bCs/>
-        </w:rPr>
-        <w:t xml:space="preserve"> </w:t>
-      </w:r>
-      <w:proofErr w:type="spellStart"/>
-      <w:r>
-        <w:rPr>
-          <w:bCs/>
-        </w:rPr>
-        <w:t>compliance</w:t>
-      </w:r>
-      <w:proofErr w:type="spellEnd"/>
-      <w:r>
-        <w:rPr>
-          <w:bCs/>
-        </w:rPr>
-        <w:t xml:space="preserve"> </w:t>
-      </w:r>
-      <w:proofErr w:type="spellStart"/>
-      <w:r>
-        <w:rPr>
-          <w:bCs/>
-        </w:rPr>
-        <w:t>with</w:t>
-      </w:r>
-      <w:proofErr w:type="spellEnd"/>
-      <w:r>
-        <w:rPr>
-          <w:bCs/>
-        </w:rPr>
-        <w:t xml:space="preserve"> </w:t>
-      </w:r>
-      <w:proofErr w:type="spellStart"/>
-      <w:r>
-        <w:rPr>
-          <w:bCs/>
-        </w:rPr>
-        <w:t>the</w:t>
-      </w:r>
-      <w:proofErr w:type="spellEnd"/>
-      <w:r>
-        <w:rPr>
-          <w:bCs/>
-        </w:rPr>
-        <w:t xml:space="preserve"> </w:t>
-      </w:r>
-      <w:proofErr w:type="spellStart"/>
-      <w:r>
-        <w:rPr>
-          <w:bCs/>
-        </w:rPr>
-        <w:t>requirements</w:t>
-      </w:r>
-      <w:proofErr w:type="spellEnd"/>
-      <w:r>
-        <w:rPr>
-          <w:bCs/>
-        </w:rPr>
-        <w:t xml:space="preserve"> are </w:t>
-      </w:r>
-      <w:proofErr w:type="spellStart"/>
-      <w:r>
-        <w:rPr>
-          <w:bCs/>
-        </w:rPr>
-        <w:t>verified</w:t>
-      </w:r>
-      <w:proofErr w:type="spellEnd"/>
-      <w:r>
-        <w:rPr>
-          <w:bCs/>
-        </w:rPr>
-        <w:t>.</w:t>
-      </w:r>
-    </w:p>
-    <w:p>
-      <w:pPr>
-        <w:rPr>
-          <w:bCs/>
-        </w:rPr>
-      </w:pPr>
-      <w:proofErr w:type="spellStart"/>
-      <w:r>
-        <w:rPr>
-          <w:bCs/>
-        </w:rPr>
-        <w:t>This</w:t>
-      </w:r>
-      <w:proofErr w:type="spellEnd"/>
-      <w:r>
-        <w:rPr>
-          <w:bCs/>
-        </w:rPr>
-        <w:t xml:space="preserve"> </w:t>
-      </w:r>
-      <w:proofErr w:type="spellStart"/>
-      <w:r>
-        <w:rPr>
-          <w:bCs/>
-        </w:rPr>
-        <w:t>paragraph</w:t>
-      </w:r>
-      <w:proofErr w:type="spellEnd"/>
-      <w:r>
-        <w:rPr>
-          <w:bCs/>
-        </w:rPr>
-        <w:t xml:space="preserve"> </w:t>
-      </w:r>
-      <w:proofErr w:type="spellStart"/>
-      <w:r>
-        <w:rPr>
-          <w:bCs/>
-        </w:rPr>
-        <w:t>is</w:t>
-      </w:r>
-      <w:proofErr w:type="spellEnd"/>
-      <w:r>
-        <w:rPr>
-          <w:bCs/>
-        </w:rPr>
-        <w:t xml:space="preserve"> </w:t>
-      </w:r>
-      <w:proofErr w:type="spellStart"/>
-      <w:r>
-        <w:rPr>
-          <w:bCs/>
-        </w:rPr>
-        <w:t>sample</w:t>
-      </w:r>
-      <w:proofErr w:type="spellEnd"/>
-      <w:r>
-        <w:rPr>
-          <w:bCs/>
-        </w:rPr>
-        <w:t xml:space="preserve"> </w:t>
-      </w:r>
-      <w:proofErr w:type="spellStart"/>
-      <w:r>
-        <w:rPr>
-          <w:bCs/>
-        </w:rPr>
-        <w:t>text</w:t>
-      </w:r>
-      <w:proofErr w:type="spellEnd"/>
-      <w:r>
-        <w:rPr>
-          <w:bCs/>
-        </w:rPr>
-        <w:t xml:space="preserve"> </w:t>
-      </w:r>
-      <w:proofErr w:type="spellStart"/>
-      <w:r>
-        <w:rPr>
-          <w:bCs/>
-        </w:rPr>
-        <w:t>used</w:t>
-      </w:r>
-      <w:proofErr w:type="spellEnd"/>
-      <w:r>
-        <w:rPr>
-          <w:bCs/>
-        </w:rPr>
-        <w:t xml:space="preserve"> </w:t>
-      </w:r>
-      <w:proofErr w:type="spellStart"/>
-      <w:r>
-        <w:rPr>
-          <w:bCs/>
-        </w:rPr>
-        <w:t>for</w:t>
-      </w:r>
-      <w:proofErr w:type="spellEnd"/>
-      <w:r>
-        <w:rPr>
-          <w:bCs/>
-        </w:rPr>
-        <w:t xml:space="preserve"> </w:t>
-      </w:r>
-      <w:proofErr w:type="spellStart"/>
-      <w:r>
-        <w:rPr>
-          <w:bCs/>
-        </w:rPr>
-        <w:t>testing</w:t>
-      </w:r>
-      <w:proofErr w:type="spellEnd"/>
-      <w:r>
-        <w:rPr>
-          <w:bCs/>
-        </w:rPr>
-        <w:t xml:space="preserve"> </w:t>
-      </w:r>
-      <w:proofErr w:type="spellStart"/>
-      <w:r>
-        <w:rPr>
-          <w:bCs/>
-        </w:rPr>
-        <w:t>document</w:t>
-      </w:r>
-      <w:proofErr w:type="spellEnd"/>
-      <w:r>
-        <w:rPr>
-          <w:bCs/>
-        </w:rPr>
-        <w:t xml:space="preserve"> </w:t>
-      </w:r>
-      <w:proofErr w:type="spellStart"/>
-      <w:r>
-        <w:rPr>
-          <w:bCs/>
-        </w:rPr>
-        <w:t>formatting</w:t>
-      </w:r>
-      <w:proofErr w:type="spellEnd"/>
-      <w:r>
-        <w:rPr>
-          <w:bCs/>
-        </w:rPr>
-        <w:t xml:space="preserve">. The </w:t>
-      </w:r>
-      <w:proofErr w:type="spellStart"/>
-      <w:r>
-        <w:rPr>
-          <w:bCs/>
-        </w:rPr>
-        <w:t>text</w:t>
-      </w:r>
-      <w:proofErr w:type="spellEnd"/>
-      <w:r>
-        <w:rPr>
-          <w:bCs/>
-        </w:rPr>
-        <w:t xml:space="preserve"> </w:t>
-      </w:r>
-      <w:proofErr w:type="spellStart"/>
-      <w:r>
-        <w:rPr>
-          <w:bCs/>
-        </w:rPr>
-        <w:t>has</w:t>
-      </w:r>
-      <w:proofErr w:type="spellEnd"/>
-      <w:r>
-        <w:rPr>
-          <w:bCs/>
-        </w:rPr>
-        <w:t xml:space="preserve"> no </w:t>
-      </w:r>
-      <w:proofErr w:type="spellStart"/>
-      <w:r>
-        <w:rPr>
-          <w:bCs/>
-        </w:rPr>
-        <w:t>meaningful</w:t>
-      </w:r>
-      <w:proofErr w:type="spellEnd"/>
-      <w:r>
-        <w:rPr>
-          <w:bCs/>
-        </w:rPr>
-        <w:t xml:space="preserve"> </w:t>
-      </w:r>
-      <w:proofErr w:type="spellStart"/>
-      <w:r>
-        <w:rPr>
-          <w:bCs/>
-        </w:rPr>
-        <w:t>content</w:t>
-      </w:r>
-      <w:proofErr w:type="spellEnd"/>
-      <w:r>
-        <w:rPr>
-          <w:bCs/>
-        </w:rPr>
-        <w:t xml:space="preserve"> and </w:t>
-      </w:r>
-      <w:proofErr w:type="spellStart"/>
-      <w:r>
-        <w:rPr>
-          <w:bCs/>
-        </w:rPr>
-        <w:t>has</w:t>
-      </w:r>
-      <w:proofErr w:type="spellEnd"/>
-      <w:r>
-        <w:rPr>
-          <w:bCs/>
-        </w:rPr>
-        <w:t xml:space="preserve"> </w:t>
-      </w:r>
-      <w:proofErr w:type="spellStart"/>
-      <w:r>
-        <w:rPr>
-          <w:bCs/>
-        </w:rPr>
-        <w:t>been</w:t>
-      </w:r>
-      <w:proofErr w:type="spellEnd"/>
-      <w:r>
-        <w:rPr>
-          <w:bCs/>
-        </w:rPr>
-        <w:t xml:space="preserve"> </w:t>
-      </w:r>
-      <w:proofErr w:type="spellStart"/>
-      <w:r>
-        <w:rPr>
-          <w:bCs/>
-        </w:rPr>
-        <w:t>created</w:t>
-      </w:r>
-      <w:proofErr w:type="spellEnd"/>
-      <w:r>
-        <w:rPr>
-          <w:bCs/>
-        </w:rPr>
-        <w:t xml:space="preserve"> </w:t>
-      </w:r>
-      <w:proofErr w:type="spellStart"/>
-      <w:r>
-        <w:rPr>
-          <w:bCs/>
-        </w:rPr>
-        <w:t>solely</w:t>
-      </w:r>
-      <w:proofErr w:type="spellEnd"/>
-      <w:r>
-        <w:rPr>
-          <w:bCs/>
-        </w:rPr>
-        <w:t xml:space="preserve"> </w:t>
-      </w:r>
-      <w:proofErr w:type="spellStart"/>
-      <w:r>
-        <w:rPr>
-          <w:bCs/>
-        </w:rPr>
-        <w:t>for</w:t>
-      </w:r>
-      <w:proofErr w:type="spellEnd"/>
-      <w:r>
-        <w:rPr>
-          <w:bCs/>
-        </w:rPr>
-        <w:t xml:space="preserve"> </w:t>
-      </w:r>
-      <w:proofErr w:type="spellStart"/>
-      <w:r>
-        <w:rPr>
-          <w:bCs/>
-        </w:rPr>
-        <w:t>the</w:t>
-      </w:r>
-      <w:proofErr w:type="spellEnd"/>
-      <w:r>
-        <w:rPr>
-          <w:bCs/>
-        </w:rPr>
-        <w:t xml:space="preserve"> </w:t>
-      </w:r>
-      <w:proofErr w:type="spellStart"/>
-      <w:r>
-        <w:rPr>
-          <w:bCs/>
-        </w:rPr>
-        <w:t>purpose</w:t>
-      </w:r>
-      <w:proofErr w:type="spellEnd"/>
-      <w:r>
-        <w:rPr>
-          <w:bCs/>
-        </w:rPr>
-        <w:t xml:space="preserve"> of </w:t>
-      </w:r>
-      <w:proofErr w:type="spellStart"/>
-      <w:r>
-        <w:rPr>
-          <w:bCs/>
-        </w:rPr>
-        <w:t>validating</w:t>
-      </w:r>
-      <w:proofErr w:type="spellEnd"/>
-      <w:r>
-        <w:rPr>
-          <w:bCs/>
-        </w:rPr>
-        <w:t xml:space="preserve"> </w:t>
-      </w:r>
-      <w:proofErr w:type="spellStart"/>
-      <w:r>
-        <w:rPr>
-          <w:bCs/>
-        </w:rPr>
-        <w:t>formatting</w:t>
-      </w:r>
-      <w:proofErr w:type="spellEnd"/>
-      <w:r>
-        <w:rPr>
-          <w:bCs/>
-        </w:rPr>
-        <w:t xml:space="preserve"> </w:t>
-      </w:r>
-      <w:proofErr w:type="spellStart"/>
-      <w:r>
-        <w:rPr>
-          <w:bCs/>
-        </w:rPr>
-        <w:t>requirements</w:t>
-      </w:r>
-      <w:proofErr w:type="spellEnd"/>
-      <w:r>
-        <w:rPr>
-          <w:bCs/>
-        </w:rPr>
-        <w:t xml:space="preserve">. The </w:t>
-      </w:r>
-      <w:proofErr w:type="spellStart"/>
-      <w:r>
-        <w:rPr>
-          <w:bCs/>
-        </w:rPr>
-        <w:t>length</w:t>
-      </w:r>
-      <w:proofErr w:type="spellEnd"/>
-      <w:r>
-        <w:rPr>
-          <w:bCs/>
-        </w:rPr>
-        <w:t xml:space="preserve"> of </w:t>
-      </w:r>
-      <w:proofErr w:type="spellStart"/>
-      <w:r>
-        <w:rPr>
-          <w:bCs/>
-        </w:rPr>
-        <w:t>the</w:t>
-      </w:r>
-      <w:proofErr w:type="spellEnd"/>
-      <w:r>
-        <w:rPr>
-          <w:bCs/>
-        </w:rPr>
-        <w:t xml:space="preserve"> </w:t>
-      </w:r>
-      <w:proofErr w:type="spellStart"/>
-      <w:r>
-        <w:rPr>
-          <w:bCs/>
-        </w:rPr>
-        <w:t>paragraph</w:t>
-      </w:r>
-      <w:proofErr w:type="spellEnd"/>
-      <w:r>
-        <w:rPr>
-          <w:bCs/>
-        </w:rPr>
-        <w:t xml:space="preserve"> </w:t>
-      </w:r>
-      <w:proofErr w:type="spellStart"/>
-      <w:r>
-        <w:rPr>
-          <w:bCs/>
-        </w:rPr>
-        <w:t>has</w:t>
-      </w:r>
-      <w:proofErr w:type="spellEnd"/>
-      <w:r>
-        <w:rPr>
-          <w:bCs/>
-        </w:rPr>
-        <w:t xml:space="preserve"> </w:t>
-      </w:r>
-      <w:proofErr w:type="spellStart"/>
-      <w:r>
-        <w:rPr>
-          <w:bCs/>
-        </w:rPr>
-        <w:t>been</w:t>
-      </w:r>
-      <w:proofErr w:type="spellEnd"/>
-      <w:r>
-        <w:rPr>
-          <w:bCs/>
-        </w:rPr>
-        <w:t xml:space="preserve"> </w:t>
-      </w:r>
-      <w:proofErr w:type="spellStart"/>
-      <w:r>
-        <w:rPr>
-          <w:bCs/>
-        </w:rPr>
-        <w:t>chosen</w:t>
-      </w:r>
-      <w:proofErr w:type="spellEnd"/>
-      <w:r>
-        <w:rPr>
-          <w:bCs/>
-        </w:rPr>
-        <w:t xml:space="preserve"> </w:t>
-      </w:r>
-      <w:proofErr w:type="spellStart"/>
-      <w:r>
-        <w:rPr>
-          <w:bCs/>
-        </w:rPr>
-        <w:t>to</w:t>
-      </w:r>
-      <w:proofErr w:type="spellEnd"/>
-      <w:r>
-        <w:rPr>
-          <w:bCs/>
-        </w:rPr>
-        <w:t xml:space="preserve"> </w:t>
-      </w:r>
-      <w:proofErr w:type="spellStart"/>
-      <w:r>
-        <w:rPr>
-          <w:bCs/>
-        </w:rPr>
-        <w:t>correspond</w:t>
-      </w:r>
-      <w:proofErr w:type="spellEnd"/>
-      <w:r>
-        <w:rPr>
-          <w:bCs/>
-        </w:rPr>
-        <w:t xml:space="preserve"> </w:t>
-      </w:r>
-      <w:proofErr w:type="spellStart"/>
-      <w:r>
-        <w:rPr>
-          <w:bCs/>
-        </w:rPr>
-        <w:t>to</w:t>
-      </w:r>
-      <w:proofErr w:type="spellEnd"/>
-      <w:r>
-        <w:rPr>
-          <w:bCs/>
-        </w:rPr>
-        <w:t xml:space="preserve"> </w:t>
-      </w:r>
-      <w:proofErr w:type="spellStart"/>
-      <w:r>
-        <w:rPr>
-          <w:bCs/>
-        </w:rPr>
-        <w:t>the</w:t>
-      </w:r>
-      <w:proofErr w:type="spellEnd"/>
-      <w:r>
-        <w:rPr>
-          <w:bCs/>
-        </w:rPr>
-        <w:t xml:space="preserve"> </w:t>
-      </w:r>
-      <w:proofErr w:type="spellStart"/>
-      <w:r>
-        <w:rPr>
-          <w:bCs/>
-        </w:rPr>
-        <w:t>volume</w:t>
-      </w:r>
-      <w:proofErr w:type="spellEnd"/>
-      <w:r>
-        <w:rPr>
-          <w:bCs/>
-        </w:rPr>
-        <w:t xml:space="preserve"> of a </w:t>
-      </w:r>
-      <w:proofErr w:type="spellStart"/>
-      <w:r>
-        <w:rPr>
-          <w:bCs/>
-        </w:rPr>
-        <w:t>typical</w:t>
-      </w:r>
-      <w:proofErr w:type="spellEnd"/>
-      <w:r>
-        <w:rPr>
-          <w:bCs/>
-        </w:rPr>
-        <w:t xml:space="preserve"> </w:t>
-      </w:r>
-      <w:proofErr w:type="spellStart"/>
-      <w:r>
-        <w:rPr>
-          <w:bCs/>
-        </w:rPr>
-        <w:t>academic</w:t>
-      </w:r>
-      <w:proofErr w:type="spellEnd"/>
-      <w:r>
-        <w:rPr>
-          <w:bCs/>
-        </w:rPr>
-        <w:t xml:space="preserve"> </w:t>
-      </w:r>
-      <w:proofErr w:type="spellStart"/>
-      <w:r>
-        <w:rPr>
-          <w:bCs/>
-        </w:rPr>
-        <w:t>text</w:t>
-      </w:r>
-      <w:proofErr w:type="spellEnd"/>
-      <w:r>
-        <w:rPr>
-          <w:bCs/>
-        </w:rPr>
-        <w:t>.</w:t>
-      </w:r>
-    </w:p>
-    <w:p>
-      <w:pPr>
-        <w:rPr>
-          <w:bCs/>
-        </w:rPr>
-      </w:pPr>
-      <w:r>
-        <w:rPr>
-          <w:bCs/>
-        </w:rPr>
-        <w:t xml:space="preserve">The </w:t>
-      </w:r>
-      <w:proofErr w:type="spellStart"/>
-      <w:r>
-        <w:rPr>
-          <w:bCs/>
-        </w:rPr>
-        <w:t>thesis</w:t>
-      </w:r>
-      <w:proofErr w:type="spellEnd"/>
-      <w:r>
-        <w:rPr>
-          <w:bCs/>
-        </w:rPr>
-        <w:t xml:space="preserve"> </w:t>
-      </w:r>
-      <w:proofErr w:type="spellStart"/>
-      <w:r>
-        <w:rPr>
-          <w:bCs/>
-        </w:rPr>
-        <w:t>is</w:t>
-      </w:r>
-      <w:proofErr w:type="spellEnd"/>
-      <w:r>
-        <w:rPr>
-          <w:bCs/>
-        </w:rPr>
-        <w:t xml:space="preserve"> in </w:t>
-      </w:r>
-      <w:r>
-        <w:rPr>
-          <w:bCs/>
-        </w:rPr>
-        <w:t>Estonian</w:t>
-      </w:r>
-      <w:r>
-        <w:rPr>
-          <w:bCs/>
-        </w:rPr>
-        <w:t xml:space="preserve"> and </w:t>
-      </w:r>
-      <w:proofErr w:type="spellStart"/>
-      <w:r>
-        <w:rPr>
-          <w:bCs/>
-        </w:rPr>
-        <w:t>contains</w:t>
-      </w:r>
-      <w:proofErr w:type="spellEnd"/>
-      <w:r>
-        <w:rPr>
-          <w:bCs/>
-        </w:rPr>
-        <w:t xml:space="preserve"> </w:t>
-      </w:r>
-      <w:r>
-        <w:rPr>
-          <w:bCs/>
-        </w:rPr>
-        <w:t>31</w:t>
-      </w:r>
-      <w:r>
-        <w:rPr>
-          <w:bCs/>
-        </w:rPr>
-        <w:t xml:space="preserve"> pages of </w:t>
-      </w:r>
-      <w:proofErr w:type="spellStart"/>
-      <w:r>
-        <w:rPr>
-          <w:bCs/>
-        </w:rPr>
-        <w:t>text</w:t>
-      </w:r>
-      <w:proofErr w:type="spellEnd"/>
-      <w:r>
-        <w:rPr>
-          <w:bCs/>
-        </w:rPr>
-        <w:t xml:space="preserve">, </w:t>
-      </w:r>
-      <w:r>
-        <w:rPr>
-          <w:bCs/>
-        </w:rPr>
-        <w:t>4</w:t>
-      </w:r>
-      <w:r>
-        <w:rPr>
-          <w:bCs/>
-        </w:rPr>
-        <w:t xml:space="preserve"> </w:t>
-      </w:r>
-      <w:proofErr w:type="spellStart"/>
-      <w:r>
-        <w:rPr>
-          <w:bCs/>
-        </w:rPr>
-        <w:t>chapters</w:t>
-      </w:r>
-      <w:proofErr w:type="spellEnd"/>
-      <w:r>
-        <w:rPr>
-          <w:bCs/>
-        </w:rPr>
-        <w:t xml:space="preserve">, </w:t>
-      </w:r>
-      <w:r>
-        <w:rPr>
-          <w:bCs/>
-        </w:rPr>
-        <w:t>3</w:t>
-      </w:r>
-      <w:r>
-        <w:rPr>
-          <w:bCs/>
-        </w:rPr>
-        <w:t xml:space="preserve"> </w:t>
-      </w:r>
-      <w:proofErr w:type="spellStart"/>
-      <w:r>
-        <w:rPr>
-          <w:bCs/>
-        </w:rPr>
-        <w:t>figures</w:t>
-      </w:r>
-      <w:proofErr w:type="spellEnd"/>
-      <w:r>
-        <w:rPr>
-          <w:bCs/>
-        </w:rPr>
-        <w:t xml:space="preserve">, </w:t>
-      </w:r>
-      <w:r>
-        <w:rPr>
-          <w:bCs/>
-        </w:rPr>
-        <w:t>1</w:t>
-      </w:r>
-      <w:r>
-        <w:rPr>
-          <w:bCs/>
-        </w:rPr>
-        <w:t xml:space="preserve"> </w:t>
-      </w:r>
-      <w:proofErr w:type="spellStart"/>
-      <w:r>
-        <w:rPr>
-          <w:bCs/>
-        </w:rPr>
-        <w:t>table</w:t>
-      </w:r>
-      <w:proofErr w:type="spellEnd"/>
-      <w:r>
-        <w:rPr>
-          <w:bCs/>
-        </w:rPr>
-        <w:t xml:space="preserve">. </w:t>
+        <w:t xml:space="preserve"> table. </w:t>
       </w:r>
     </w:p>
     <w:p>
@@ -3702,34 +829,14 @@
                 <w:i/>
               </w:rPr>
             </w:pPr>
-            <w:proofErr w:type="spellStart"/>
             <w:r>
               <w:rPr>
                 <w:i/>
                 <w:iCs/>
                 <w:szCs w:val="22"/>
               </w:rPr>
-              <w:t>Artificial</w:t>
+              <w:t>Artificial  Intelligence</w:t>
             </w:r>
-            <w:proofErr w:type="spellEnd"/>
-            <w:r>
-              <w:rPr>
-                <w:i/>
-                <w:iCs/>
-                <w:szCs w:val="22"/>
-              </w:rPr>
-              <w:t xml:space="preserve">  </w:t>
-            </w:r>
-            <w:proofErr w:type="spellStart"/>
-            <w:r>
-              <w:rPr>
-                <w:i/>
-                <w:iCs/>
-                <w:szCs w:val="22"/>
-              </w:rPr>
-              <w:t>Intelligence</w:t>
-            </w:r>
-            <w:proofErr w:type="spellEnd"/>
             <w:r>
               <w:rPr>
                 <w:szCs w:val="22"/>
@@ -3768,30 +875,8 @@
               <w:rPr>
                 <w:i/>
               </w:rPr>
-              <w:t xml:space="preserve">Dots </w:t>
+              <w:t>Dots per inch</w:t>
             </w:r>
-            <w:proofErr w:type="spellStart"/>
-            <w:r>
-              <w:rPr>
-                <w:i/>
-              </w:rPr>
-              <w:t>per</w:t>
-            </w:r>
-            <w:proofErr w:type="spellEnd"/>
-            <w:r>
-              <w:rPr>
-                <w:i/>
-              </w:rPr>
-              <w:t xml:space="preserve"> </w:t>
-            </w:r>
-            <w:proofErr w:type="spellStart"/>
-            <w:r>
-              <w:rPr>
-                <w:i/>
-              </w:rPr>
-              <w:t>inch</w:t>
-            </w:r>
-            <w:proofErr w:type="spellEnd"/>
             <w:r>
               <w:t>, punkti tolli kohta</w:t>
             </w:r>
@@ -5750,31 +2835,13 @@
       <w:r>
         <w:t xml:space="preserve"> Nüüd mainitakse lühendite ja mõistete sõnastiku esimest mõistet AI (</w:t>
       </w:r>
-      <w:proofErr w:type="spellStart"/>
       <w:r>
         <w:rPr>
           <w:i/>
           <w:iCs/>
         </w:rPr>
-        <w:t>Artificial</w:t>
-      </w:r>
-      <w:proofErr w:type="spellEnd"/>
-      <w:r>
-        <w:rPr>
-          <w:i/>
-          <w:iCs/>
-        </w:rPr>
-        <w:t xml:space="preserve"> </w:t>
-      </w:r>
-      <w:proofErr w:type="spellStart"/>
-      <w:r>
-        <w:rPr>
-          <w:i/>
-          <w:iCs/>
-        </w:rPr>
-        <w:t>Intelligence</w:t>
-      </w:r>
-      <w:proofErr w:type="spellEnd"/>
+        <w:t>Artificial Intelligence</w:t>
+      </w:r>
       <w:r>
         <w:t>).</w:t>
       </w:r>
@@ -5827,33 +2894,8 @@
           <w:i/>
           <w:iCs/>
         </w:rPr>
-        <w:t xml:space="preserve">Dots </w:t>
-      </w:r>
-      <w:proofErr w:type="spellStart"/>
-      <w:r>
-        <w:rPr>
-          <w:i/>
-          <w:iCs/>
-        </w:rPr>
-        <w:t>per</w:t>
-      </w:r>
-      <w:proofErr w:type="spellEnd"/>
-      <w:r>
-        <w:rPr>
-          <w:i/>
-          <w:iCs/>
-        </w:rPr>
-        <w:t xml:space="preserve"> </w:t>
-      </w:r>
-      <w:proofErr w:type="spellStart"/>
-      <w:r>
-        <w:rPr>
-          <w:i/>
-          <w:iCs/>
-        </w:rPr>
-        <w:t>inch</w:t>
-      </w:r>
-      <w:proofErr w:type="spellEnd"/>
+        <w:t>Dots per inch</w:t>
+      </w:r>
       <w:r>
         <w:t>).</w:t>
       </w:r>
@@ -6371,97 +3413,101 @@
           <w:szCs w:val="22"/>
         </w:rPr>
       </w:pPr>
-      <w:proofErr w:type="spellStart"/>
       <w:r>
         <w:rPr>
           <w:rFonts w:ascii="Courier New" w:hAnsi="Courier New" w:cs="Courier New"/>
           <w:sz w:val="22"/>
           <w:szCs w:val="22"/>
         </w:rPr>
-        <w:t>def</w:t>
-      </w:r>
-      <w:proofErr w:type="spellEnd"/>
-      <w:r>
+        <w:t>def calculate_sum(numbers):</w:t>
+      </w:r>
+    </w:p>
+    <w:p>
+      <w:pPr>
+        <w:spacing w:before="40" w:after="40" w:line="240" w:lineRule="auto"/>
+        <w:jc w:val="left"/>
         <w:rPr>
           <w:rFonts w:ascii="Courier New" w:hAnsi="Courier New" w:cs="Courier New"/>
           <w:sz w:val="22"/>
           <w:szCs w:val="22"/>
         </w:rPr>
-        <w:t xml:space="preserve"> </w:t>
-      </w:r>
-      <w:proofErr w:type="spellStart"/>
+      </w:pPr>
       <w:r>
         <w:rPr>
           <w:rFonts w:ascii="Courier New" w:hAnsi="Courier New" w:cs="Courier New"/>
           <w:sz w:val="22"/>
           <w:szCs w:val="22"/>
         </w:rPr>
-        <w:t>calculate_sum</w:t>
-      </w:r>
-      <w:proofErr w:type="spellEnd"/>
-      <w:r>
+        <w:t xml:space="preserve">    total = 0</w:t>
+      </w:r>
+    </w:p>
+    <w:p>
+      <w:pPr>
+        <w:spacing w:before="40" w:after="40" w:line="240" w:lineRule="auto"/>
+        <w:jc w:val="left"/>
         <w:rPr>
           <w:rFonts w:ascii="Courier New" w:hAnsi="Courier New" w:cs="Courier New"/>
           <w:sz w:val="22"/>
           <w:szCs w:val="22"/>
         </w:rPr>
-        <w:t>(</w:t>
-      </w:r>
-      <w:proofErr w:type="spellStart"/>
+      </w:pPr>
       <w:r>
         <w:rPr>
           <w:rFonts w:ascii="Courier New" w:hAnsi="Courier New" w:cs="Courier New"/>
           <w:sz w:val="22"/>
           <w:szCs w:val="22"/>
         </w:rPr>
-        <w:t>numbers</w:t>
-      </w:r>
-      <w:proofErr w:type="spellEnd"/>
-      <w:r>
+        <w:t xml:space="preserve">    for number in numbers:</w:t>
+      </w:r>
+    </w:p>
+    <w:p>
+      <w:pPr>
+        <w:spacing w:before="40" w:after="40" w:line="240" w:lineRule="auto"/>
+        <w:jc w:val="left"/>
         <w:rPr>
           <w:rFonts w:ascii="Courier New" w:hAnsi="Courier New" w:cs="Courier New"/>
           <w:sz w:val="22"/>
           <w:szCs w:val="22"/>
         </w:rPr>
-        <w:t>):</w:t>
-      </w:r>
-    </w:p>
-    <w:p>
-      <w:pPr>
-        <w:spacing w:before="40" w:after="40" w:line="240" w:lineRule="auto"/>
-        <w:jc w:val="left"/>
+      </w:pPr>
+      <w:r>
         <w:rPr>
           <w:rFonts w:ascii="Courier New" w:hAnsi="Courier New" w:cs="Courier New"/>
           <w:sz w:val="22"/>
           <w:szCs w:val="22"/>
         </w:rPr>
-      </w:pPr>
-      <w:r>
+        <w:t xml:space="preserve">        total += number</w:t>
+      </w:r>
+    </w:p>
+    <w:p>
+      <w:pPr>
+        <w:spacing w:before="40" w:after="40" w:line="240" w:lineRule="auto"/>
+        <w:jc w:val="left"/>
         <w:rPr>
           <w:rFonts w:ascii="Courier New" w:hAnsi="Courier New" w:cs="Courier New"/>
           <w:sz w:val="22"/>
           <w:szCs w:val="22"/>
         </w:rPr>
-        <w:t xml:space="preserve">    </w:t>
-      </w:r>
-      <w:proofErr w:type="spellStart"/>
+      </w:pPr>
       <w:r>
         <w:rPr>
           <w:rFonts w:ascii="Courier New" w:hAnsi="Courier New" w:cs="Courier New"/>
           <w:sz w:val="22"/>
           <w:szCs w:val="22"/>
         </w:rPr>
-        <w:t>total</w:t>
-      </w:r>
-      <w:proofErr w:type="spellEnd"/>
-      <w:r>
+        <w:t xml:space="preserve">    return total</w:t>
+      </w:r>
+    </w:p>
+    <w:p>
+      <w:pPr>
+        <w:spacing w:before="40" w:after="40" w:line="240" w:lineRule="auto"/>
+        <w:jc w:val="left"/>
         <w:rPr>
           <w:rFonts w:ascii="Courier New" w:hAnsi="Courier New" w:cs="Courier New"/>
           <w:sz w:val="22"/>
           <w:szCs w:val="22"/>
         </w:rPr>
-        <w:t xml:space="preserve"> = 0</w:t>
-      </w:r>
+      </w:pPr>
     </w:p>
     <w:p>
       <w:pPr>
@@ -6479,43 +3525,77 @@
           <w:sz w:val="22"/>
           <w:szCs w:val="22"/>
         </w:rPr>
-        <w:t xml:space="preserve">    </w:t>
-      </w:r>
-      <w:proofErr w:type="spellStart"/>
-      <w:r>
+        <w:t>result = calculate_sum([1, 2, 3, 4, 5])</w:t>
+      </w:r>
+    </w:p>
+    <w:p>
+      <w:pPr>
+        <w:keepNext/>
+        <w:spacing w:before="40" w:after="40" w:line="240" w:lineRule="auto"/>
+        <w:jc w:val="left"/>
         <w:rPr>
           <w:rFonts w:ascii="Courier New" w:hAnsi="Courier New" w:cs="Courier New"/>
           <w:sz w:val="22"/>
           <w:szCs w:val="22"/>
         </w:rPr>
-        <w:t>for</w:t>
-      </w:r>
-      <w:proofErr w:type="spellEnd"/>
+      </w:pPr>
       <w:r>
         <w:rPr>
           <w:rFonts w:ascii="Courier New" w:hAnsi="Courier New" w:cs="Courier New"/>
           <w:sz w:val="22"/>
           <w:szCs w:val="22"/>
         </w:rPr>
-        <w:t xml:space="preserve"> number in </w:t>
-      </w:r>
-      <w:proofErr w:type="spellStart"/>
-      <w:r>
-        <w:rPr>
-          <w:rFonts w:ascii="Courier New" w:hAnsi="Courier New" w:cs="Courier New"/>
+        <w:t>print(f"Sum: {result}")</w:t>
+      </w:r>
+    </w:p>
+    <w:p>
+      <w:pPr>
+        <w:pStyle w:val="Caption"/>
+      </w:pPr>
+      <w:bookmarkStart w:id="7" w:name="_Toc227257333"/>
+      <w:r>
+        <w:t xml:space="preserve">Joonis </w:t>
+      </w:r>
+      <w:fldSimple w:instr=" SEQ Joonis \* ARABIC ">
+        <w:r>
+          <w:rPr>
+            <w:noProof/>
+          </w:rPr>
+          <w:t>2</w:t>
+        </w:r>
+      </w:fldSimple>
+      <w:r>
+        <w:t>. Näidisjoonis valideerimisreeglite kontrollimiseks.</w:t>
+      </w:r>
+      <w:bookmarkEnd w:id="7"/>
+    </w:p>
+    <w:p>
+      <w:r>
+        <w:t>Käesolev lõik on näidistekst, mida kasutatakse dokumendi vormistuse testimiseks. Tekst ei oma sisulist tähendust ning on koostatud üksnes vormistusnõuete kontrollimise eesmärgil. Lõigu pikkus on valitud selliselt, et see vastaks tüüpilise akadeemilise teksti mahule.</w:t>
+      </w:r>
+    </w:p>
+    <w:p>
+      <w:pPr>
+        <w:pStyle w:val="Heading3"/>
+        <w:rPr>
           <w:sz w:val="22"/>
           <w:szCs w:val="22"/>
         </w:rPr>
-        <w:t>numbers</w:t>
-      </w:r>
-      <w:proofErr w:type="spellEnd"/>
-      <w:r>
-        <w:rPr>
-          <w:rFonts w:ascii="Courier New" w:hAnsi="Courier New" w:cs="Courier New"/>
+      </w:pPr>
+      <w:bookmarkStart w:id="8" w:name="_Toc228722841"/>
+      <w:r>
+        <w:rPr>
           <w:sz w:val="22"/>
           <w:szCs w:val="22"/>
         </w:rPr>
-        <w:t>:</w:t>
+        <w:lastRenderedPageBreak/>
+        <w:t>Alapeatüki alapeatükk</w:t>
+      </w:r>
+      <w:bookmarkEnd w:id="8"/>
+    </w:p>
+    <w:p>
+      <w:r>
+        <w:t>Järgnevas lõigus käsitletakse täiendavaid aspekte, mis on vajalikud testimise läbiviimiseks. Erinevad vormistuselemendid, sealhulgas pealkirjad, lõigud ja tabelid, on paigutatud dokumenti selliselt, et valideerimisreeglite kontrollimiseks oleks piisavalt materjali. Testimise käigus kontrollitakse nii vormistuse kui ka struktuuri vastavust nõuetele. Järgnevalt illustreeritakse programmikoodiga seotud valideerimisreeglite toimimist Joonisega 3.</w:t>
       </w:r>
     </w:p>
     <w:p>
@@ -6523,36 +3603,18 @@
         <w:spacing w:before="40" w:after="40" w:line="240" w:lineRule="auto"/>
         <w:jc w:val="left"/>
         <w:rPr>
-          <w:rFonts w:ascii="Courier New" w:hAnsi="Courier New" w:cs="Courier New"/>
-          <w:sz w:val="22"/>
-          <w:szCs w:val="22"/>
-        </w:rPr>
-      </w:pPr>
-      <w:r>
-        <w:rPr>
-          <w:rFonts w:ascii="Courier New" w:hAnsi="Courier New" w:cs="Courier New"/>
-          <w:sz w:val="22"/>
-          <w:szCs w:val="22"/>
-        </w:rPr>
-        <w:t xml:space="preserve">        </w:t>
-      </w:r>
-      <w:proofErr w:type="spellStart"/>
-      <w:r>
-        <w:rPr>
-          <w:rFonts w:ascii="Courier New" w:hAnsi="Courier New" w:cs="Courier New"/>
-          <w:sz w:val="22"/>
-          <w:szCs w:val="22"/>
-        </w:rPr>
-        <w:t>total</w:t>
-      </w:r>
-      <w:proofErr w:type="spellEnd"/>
-      <w:r>
-        <w:rPr>
-          <w:rFonts w:ascii="Courier New" w:hAnsi="Courier New" w:cs="Courier New"/>
-          <w:sz w:val="22"/>
-          <w:szCs w:val="22"/>
-        </w:rPr>
-        <w:t xml:space="preserve"> += number</w:t>
+          <w:rFonts w:ascii="Consolas" w:hAnsi="Consolas" w:cs="Consolas"/>
+          <w:sz w:val="18"/>
+          <w:szCs w:val="18"/>
+        </w:rPr>
+      </w:pPr>
+      <w:r>
+        <w:rPr>
+          <w:rFonts w:ascii="Consolas" w:hAnsi="Consolas" w:cs="Consolas"/>
+          <w:sz w:val="18"/>
+          <w:szCs w:val="18"/>
+        </w:rPr>
+        <w:t>def calculate_sum(numbers):</w:t>
       </w:r>
     </w:p>
     <w:p>
@@ -6560,104 +3622,105 @@
         <w:spacing w:before="40" w:after="40" w:line="240" w:lineRule="auto"/>
         <w:jc w:val="left"/>
         <w:rPr>
-          <w:rFonts w:ascii="Courier New" w:hAnsi="Courier New" w:cs="Courier New"/>
-          <w:sz w:val="22"/>
-          <w:szCs w:val="22"/>
-        </w:rPr>
-      </w:pPr>
-      <w:r>
-        <w:rPr>
-          <w:rFonts w:ascii="Courier New" w:hAnsi="Courier New" w:cs="Courier New"/>
-          <w:sz w:val="22"/>
-          <w:szCs w:val="22"/>
-        </w:rPr>
-        <w:t xml:space="preserve">    </w:t>
-      </w:r>
-      <w:proofErr w:type="spellStart"/>
-      <w:r>
-        <w:rPr>
-          <w:rFonts w:ascii="Courier New" w:hAnsi="Courier New" w:cs="Courier New"/>
-          <w:sz w:val="22"/>
-          <w:szCs w:val="22"/>
-        </w:rPr>
-        <w:t>return</w:t>
-      </w:r>
-      <w:proofErr w:type="spellEnd"/>
-      <w:r>
-        <w:rPr>
-          <w:rFonts w:ascii="Courier New" w:hAnsi="Courier New" w:cs="Courier New"/>
-          <w:sz w:val="22"/>
-          <w:szCs w:val="22"/>
-        </w:rPr>
-        <w:t xml:space="preserve"> </w:t>
-      </w:r>
-      <w:proofErr w:type="spellStart"/>
-      <w:r>
-        <w:rPr>
-          <w:rFonts w:ascii="Courier New" w:hAnsi="Courier New" w:cs="Courier New"/>
-          <w:sz w:val="22"/>
-          <w:szCs w:val="22"/>
-        </w:rPr>
-        <w:t>total</w:t>
-      </w:r>
-      <w:proofErr w:type="spellEnd"/>
+          <w:rFonts w:ascii="Consolas" w:hAnsi="Consolas" w:cs="Consolas"/>
+          <w:sz w:val="18"/>
+          <w:szCs w:val="18"/>
+        </w:rPr>
+      </w:pPr>
+      <w:r>
+        <w:rPr>
+          <w:rFonts w:ascii="Consolas" w:hAnsi="Consolas" w:cs="Consolas"/>
+          <w:sz w:val="18"/>
+          <w:szCs w:val="18"/>
+        </w:rPr>
+        <w:t xml:space="preserve">    total = 0</w:t>
+      </w:r>
     </w:p>
     <w:p>
       <w:pPr>
         <w:spacing w:before="40" w:after="40" w:line="240" w:lineRule="auto"/>
         <w:jc w:val="left"/>
         <w:rPr>
-          <w:rFonts w:ascii="Courier New" w:hAnsi="Courier New" w:cs="Courier New"/>
-          <w:sz w:val="22"/>
-          <w:szCs w:val="22"/>
-        </w:rPr>
-      </w:pPr>
+          <w:rFonts w:ascii="Consolas" w:hAnsi="Consolas" w:cs="Consolas"/>
+          <w:sz w:val="18"/>
+          <w:szCs w:val="18"/>
+        </w:rPr>
+      </w:pPr>
+      <w:r>
+        <w:rPr>
+          <w:rFonts w:ascii="Consolas" w:hAnsi="Consolas" w:cs="Consolas"/>
+          <w:sz w:val="18"/>
+          <w:szCs w:val="18"/>
+        </w:rPr>
+        <w:t xml:space="preserve">    for number in numbers:</w:t>
+      </w:r>
     </w:p>
     <w:p>
       <w:pPr>
         <w:spacing w:before="40" w:after="40" w:line="240" w:lineRule="auto"/>
         <w:jc w:val="left"/>
         <w:rPr>
-          <w:rFonts w:ascii="Courier New" w:hAnsi="Courier New" w:cs="Courier New"/>
-          <w:sz w:val="22"/>
-          <w:szCs w:val="22"/>
-        </w:rPr>
-      </w:pPr>
-      <w:proofErr w:type="spellStart"/>
-      <w:r>
-        <w:rPr>
-          <w:rFonts w:ascii="Courier New" w:hAnsi="Courier New" w:cs="Courier New"/>
-          <w:sz w:val="22"/>
-          <w:szCs w:val="22"/>
-        </w:rPr>
-        <w:t>result</w:t>
-      </w:r>
-      <w:proofErr w:type="spellEnd"/>
-      <w:r>
-        <w:rPr>
-          <w:rFonts w:ascii="Courier New" w:hAnsi="Courier New" w:cs="Courier New"/>
-          <w:sz w:val="22"/>
-          <w:szCs w:val="22"/>
-        </w:rPr>
-        <w:t xml:space="preserve"> = </w:t>
-      </w:r>
-      <w:proofErr w:type="spellStart"/>
-      <w:r>
-        <w:rPr>
-          <w:rFonts w:ascii="Courier New" w:hAnsi="Courier New" w:cs="Courier New"/>
-          <w:sz w:val="22"/>
-          <w:szCs w:val="22"/>
-        </w:rPr>
-        <w:t>calculate_sum</w:t>
-      </w:r>
-      <w:proofErr w:type="spellEnd"/>
-      <w:r>
-        <w:rPr>
-          <w:rFonts w:ascii="Courier New" w:hAnsi="Courier New" w:cs="Courier New"/>
-          <w:sz w:val="22"/>
-          <w:szCs w:val="22"/>
-        </w:rPr>
-        <w:t>([1, 2, 3, 4, 5])</w:t>
+          <w:rFonts w:ascii="Consolas" w:hAnsi="Consolas" w:cs="Consolas"/>
+          <w:sz w:val="18"/>
+          <w:szCs w:val="18"/>
+        </w:rPr>
+      </w:pPr>
+      <w:r>
+        <w:rPr>
+          <w:rFonts w:ascii="Consolas" w:hAnsi="Consolas" w:cs="Consolas"/>
+          <w:sz w:val="18"/>
+          <w:szCs w:val="18"/>
+        </w:rPr>
+        <w:t xml:space="preserve">        total += number</w:t>
+      </w:r>
+    </w:p>
+    <w:p>
+      <w:pPr>
+        <w:spacing w:before="40" w:after="40" w:line="240" w:lineRule="auto"/>
+        <w:jc w:val="left"/>
+        <w:rPr>
+          <w:rFonts w:ascii="Consolas" w:hAnsi="Consolas" w:cs="Consolas"/>
+          <w:sz w:val="18"/>
+          <w:szCs w:val="18"/>
+        </w:rPr>
+      </w:pPr>
+      <w:r>
+        <w:rPr>
+          <w:rFonts w:ascii="Consolas" w:hAnsi="Consolas" w:cs="Consolas"/>
+          <w:sz w:val="18"/>
+          <w:szCs w:val="18"/>
+        </w:rPr>
+        <w:t xml:space="preserve">    return total</w:t>
+      </w:r>
+    </w:p>
+    <w:p>
+      <w:pPr>
+        <w:spacing w:before="40" w:after="40" w:line="240" w:lineRule="auto"/>
+        <w:jc w:val="left"/>
+        <w:rPr>
+          <w:rFonts w:ascii="Consolas" w:hAnsi="Consolas" w:cs="Consolas"/>
+          <w:sz w:val="18"/>
+          <w:szCs w:val="18"/>
+        </w:rPr>
+      </w:pPr>
+    </w:p>
+    <w:p>
+      <w:pPr>
+        <w:spacing w:before="40" w:after="40" w:line="240" w:lineRule="auto"/>
+        <w:jc w:val="left"/>
+        <w:rPr>
+          <w:rFonts w:ascii="Consolas" w:hAnsi="Consolas" w:cs="Consolas"/>
+          <w:sz w:val="18"/>
+          <w:szCs w:val="18"/>
+        </w:rPr>
+      </w:pPr>
+      <w:r>
+        <w:rPr>
+          <w:rFonts w:ascii="Consolas" w:hAnsi="Consolas" w:cs="Consolas"/>
+          <w:sz w:val="18"/>
+          <w:szCs w:val="18"/>
+        </w:rPr>
+        <w:t>result = calculate_sum([1, 2, 3, 4, 5])</w:t>
       </w:r>
     </w:p>
     <w:p>
@@ -6666,459 +3729,18 @@
         <w:spacing w:before="40" w:after="40" w:line="240" w:lineRule="auto"/>
         <w:jc w:val="left"/>
         <w:rPr>
-          <w:rFonts w:ascii="Courier New" w:hAnsi="Courier New" w:cs="Courier New"/>
-          <w:sz w:val="22"/>
-          <w:szCs w:val="22"/>
-        </w:rPr>
-      </w:pPr>
-      <w:r>
-        <w:rPr>
-          <w:rFonts w:ascii="Courier New" w:hAnsi="Courier New" w:cs="Courier New"/>
-          <w:sz w:val="22"/>
-          <w:szCs w:val="22"/>
-        </w:rPr>
-        <w:t>print(</w:t>
-      </w:r>
-      <w:proofErr w:type="spellStart"/>
-      <w:r>
-        <w:rPr>
-          <w:rFonts w:ascii="Courier New" w:hAnsi="Courier New" w:cs="Courier New"/>
-          <w:sz w:val="22"/>
-          <w:szCs w:val="22"/>
-        </w:rPr>
-        <w:t>f"Sum</w:t>
-      </w:r>
-      <w:proofErr w:type="spellEnd"/>
-      <w:r>
-        <w:rPr>
-          <w:rFonts w:ascii="Courier New" w:hAnsi="Courier New" w:cs="Courier New"/>
-          <w:sz w:val="22"/>
-          <w:szCs w:val="22"/>
-        </w:rPr>
-        <w:t>: {</w:t>
-      </w:r>
-      <w:proofErr w:type="spellStart"/>
-      <w:r>
-        <w:rPr>
-          <w:rFonts w:ascii="Courier New" w:hAnsi="Courier New" w:cs="Courier New"/>
-          <w:sz w:val="22"/>
-          <w:szCs w:val="22"/>
-        </w:rPr>
-        <w:t>result</w:t>
-      </w:r>
-      <w:proofErr w:type="spellEnd"/>
-      <w:r>
-        <w:rPr>
-          <w:rFonts w:ascii="Courier New" w:hAnsi="Courier New" w:cs="Courier New"/>
-          <w:sz w:val="22"/>
-          <w:szCs w:val="22"/>
-        </w:rPr>
-        <w:t>}")</w:t>
-      </w:r>
-    </w:p>
-    <w:p>
-      <w:pPr>
-        <w:pStyle w:val="Caption"/>
-      </w:pPr>
-      <w:bookmarkStart w:id="7" w:name="_Toc227257333"/>
-      <w:r>
-        <w:t xml:space="preserve">Joonis </w:t>
-      </w:r>
-      <w:fldSimple w:instr=" SEQ Joonis \* ARABIC ">
-        <w:r>
-          <w:rPr>
-            <w:noProof/>
-          </w:rPr>
-          <w:t>2</w:t>
-        </w:r>
-      </w:fldSimple>
-      <w:r>
-        <w:t>. Näidisjoonis valideerimisreeglite kontrollimiseks.</w:t>
-      </w:r>
-      <w:bookmarkEnd w:id="7"/>
-    </w:p>
-    <w:p>
-      <w:r>
-        <w:t>Käesolev lõik on näidistekst, mida kasutatakse dokumendi vormistuse testimiseks. Tekst ei oma sisulist tähendust ning on koostatud üksnes vormistusnõuete kontrollimise eesmärgil. Lõigu pikkus on valitud selliselt, et see vastaks tüüpilise akadeemilise teksti mahule.</w:t>
-      </w:r>
-    </w:p>
-    <w:p>
-      <w:pPr>
-        <w:pStyle w:val="Heading3"/>
-        <w:rPr>
-          <w:sz w:val="22"/>
-          <w:szCs w:val="22"/>
-        </w:rPr>
-      </w:pPr>
-      <w:bookmarkStart w:id="8" w:name="_Toc228722841"/>
-      <w:r>
-        <w:rPr>
-          <w:sz w:val="22"/>
-          <w:szCs w:val="22"/>
-        </w:rPr>
-        <w:lastRenderedPageBreak/>
-        <w:t>Alapeatüki alapeatükk</w:t>
-      </w:r>
-      <w:bookmarkEnd w:id="8"/>
-    </w:p>
-    <w:p>
-      <w:r>
-        <w:t>Järgnevas lõigus käsitletakse täiendavaid aspekte, mis on vajalikud testimise läbiviimiseks. Erinevad vormistuselemendid, sealhulgas pealkirjad, lõigud ja tabelid, on paigutatud dokumenti selliselt, et valideerimisreeglite kontrollimiseks oleks piisavalt materjali. Testimise käigus kontrollitakse nii vormistuse kui ka struktuuri vastavust nõuetele. Järgnevalt illustreeritakse programmikoodiga seotud valideerimisreeglite toimimist Joonisega 3.</w:t>
-      </w:r>
-    </w:p>
-    <w:p>
-      <w:pPr>
-        <w:spacing w:before="40" w:after="40" w:line="240" w:lineRule="auto"/>
-        <w:jc w:val="left"/>
-        <w:rPr>
           <w:rFonts w:ascii="Consolas" w:hAnsi="Consolas" w:cs="Consolas"/>
           <w:sz w:val="18"/>
           <w:szCs w:val="18"/>
         </w:rPr>
       </w:pPr>
-      <w:proofErr w:type="spellStart"/>
       <w:r>
         <w:rPr>
           <w:rFonts w:ascii="Consolas" w:hAnsi="Consolas" w:cs="Consolas"/>
           <w:sz w:val="18"/>
           <w:szCs w:val="18"/>
         </w:rPr>
-        <w:t>def</w:t>
-      </w:r>
-      <w:proofErr w:type="spellEnd"/>
-      <w:r>
-        <w:rPr>
-          <w:rFonts w:ascii="Consolas" w:hAnsi="Consolas" w:cs="Consolas"/>
-          <w:sz w:val="18"/>
-          <w:szCs w:val="18"/>
-        </w:rPr>
-        <w:t xml:space="preserve"> </w:t>
-      </w:r>
-      <w:proofErr w:type="spellStart"/>
-      <w:r>
-        <w:rPr>
-          <w:rFonts w:ascii="Consolas" w:hAnsi="Consolas" w:cs="Consolas"/>
-          <w:sz w:val="18"/>
-          <w:szCs w:val="18"/>
-        </w:rPr>
-        <w:t>calculate_sum</w:t>
-      </w:r>
-      <w:proofErr w:type="spellEnd"/>
-      <w:r>
-        <w:rPr>
-          <w:rFonts w:ascii="Consolas" w:hAnsi="Consolas" w:cs="Consolas"/>
-          <w:sz w:val="18"/>
-          <w:szCs w:val="18"/>
-        </w:rPr>
-        <w:t>(</w:t>
-      </w:r>
-      <w:proofErr w:type="spellStart"/>
-      <w:r>
-        <w:rPr>
-          <w:rFonts w:ascii="Consolas" w:hAnsi="Consolas" w:cs="Consolas"/>
-          <w:sz w:val="18"/>
-          <w:szCs w:val="18"/>
-        </w:rPr>
-        <w:t>numbers</w:t>
-      </w:r>
-      <w:proofErr w:type="spellEnd"/>
-      <w:r>
-        <w:rPr>
-          <w:rFonts w:ascii="Consolas" w:hAnsi="Consolas" w:cs="Consolas"/>
-          <w:sz w:val="18"/>
-          <w:szCs w:val="18"/>
-        </w:rPr>
-        <w:t>):</w:t>
-      </w:r>
-    </w:p>
-    <w:p>
-      <w:pPr>
-        <w:spacing w:before="40" w:after="40" w:line="240" w:lineRule="auto"/>
-        <w:jc w:val="left"/>
-        <w:rPr>
-          <w:rFonts w:ascii="Consolas" w:hAnsi="Consolas" w:cs="Consolas"/>
-          <w:sz w:val="18"/>
-          <w:szCs w:val="18"/>
-        </w:rPr>
-      </w:pPr>
-      <w:r>
-        <w:rPr>
-          <w:rFonts w:ascii="Consolas" w:hAnsi="Consolas" w:cs="Consolas"/>
-          <w:sz w:val="18"/>
-          <w:szCs w:val="18"/>
-        </w:rPr>
-        <w:t xml:space="preserve">    </w:t>
-      </w:r>
-      <w:proofErr w:type="spellStart"/>
-      <w:r>
-        <w:rPr>
-          <w:rFonts w:ascii="Consolas" w:hAnsi="Consolas" w:cs="Consolas"/>
-          <w:sz w:val="18"/>
-          <w:szCs w:val="18"/>
-        </w:rPr>
-        <w:t>total</w:t>
-      </w:r>
-      <w:proofErr w:type="spellEnd"/>
-      <w:r>
-        <w:rPr>
-          <w:rFonts w:ascii="Consolas" w:hAnsi="Consolas" w:cs="Consolas"/>
-          <w:sz w:val="18"/>
-          <w:szCs w:val="18"/>
-        </w:rPr>
-        <w:t xml:space="preserve"> = 0</w:t>
-      </w:r>
-    </w:p>
-    <w:p>
-      <w:pPr>
-        <w:spacing w:before="40" w:after="40" w:line="240" w:lineRule="auto"/>
-        <w:jc w:val="left"/>
-        <w:rPr>
-          <w:rFonts w:ascii="Consolas" w:hAnsi="Consolas" w:cs="Consolas"/>
-          <w:sz w:val="18"/>
-          <w:szCs w:val="18"/>
-        </w:rPr>
-      </w:pPr>
-      <w:r>
-        <w:rPr>
-          <w:rFonts w:ascii="Consolas" w:hAnsi="Consolas" w:cs="Consolas"/>
-          <w:sz w:val="18"/>
-          <w:szCs w:val="18"/>
-        </w:rPr>
-        <w:t xml:space="preserve">    </w:t>
-      </w:r>
-      <w:proofErr w:type="spellStart"/>
-      <w:r>
-        <w:rPr>
-          <w:rFonts w:ascii="Consolas" w:hAnsi="Consolas" w:cs="Consolas"/>
-          <w:sz w:val="18"/>
-          <w:szCs w:val="18"/>
-        </w:rPr>
-        <w:t>for</w:t>
-      </w:r>
-      <w:proofErr w:type="spellEnd"/>
-      <w:r>
-        <w:rPr>
-          <w:rFonts w:ascii="Consolas" w:hAnsi="Consolas" w:cs="Consolas"/>
-          <w:sz w:val="18"/>
-          <w:szCs w:val="18"/>
-        </w:rPr>
-        <w:t xml:space="preserve"> number in </w:t>
-      </w:r>
-      <w:proofErr w:type="spellStart"/>
-      <w:r>
-        <w:rPr>
-          <w:rFonts w:ascii="Consolas" w:hAnsi="Consolas" w:cs="Consolas"/>
-          <w:sz w:val="18"/>
-          <w:szCs w:val="18"/>
-        </w:rPr>
-        <w:t>numbers</w:t>
-      </w:r>
-      <w:proofErr w:type="spellEnd"/>
-      <w:r>
-        <w:rPr>
-          <w:rFonts w:ascii="Consolas" w:hAnsi="Consolas" w:cs="Consolas"/>
-          <w:sz w:val="18"/>
-          <w:szCs w:val="18"/>
-        </w:rPr>
-        <w:t>:</w:t>
-      </w:r>
-    </w:p>
-    <w:p>
-      <w:pPr>
-        <w:spacing w:before="40" w:after="40" w:line="240" w:lineRule="auto"/>
-        <w:jc w:val="left"/>
-        <w:rPr>
-          <w:rFonts w:ascii="Consolas" w:hAnsi="Consolas" w:cs="Consolas"/>
-          <w:sz w:val="18"/>
-          <w:szCs w:val="18"/>
-        </w:rPr>
-      </w:pPr>
-      <w:r>
-        <w:rPr>
-          <w:rFonts w:ascii="Consolas" w:hAnsi="Consolas" w:cs="Consolas"/>
-          <w:sz w:val="18"/>
-          <w:szCs w:val="18"/>
-        </w:rPr>
-        <w:t xml:space="preserve">        </w:t>
-      </w:r>
-      <w:proofErr w:type="spellStart"/>
-      <w:r>
-        <w:rPr>
-          <w:rFonts w:ascii="Consolas" w:hAnsi="Consolas" w:cs="Consolas"/>
-          <w:sz w:val="18"/>
-          <w:szCs w:val="18"/>
-        </w:rPr>
-        <w:t>total</w:t>
-      </w:r>
-      <w:proofErr w:type="spellEnd"/>
-      <w:r>
-        <w:rPr>
-          <w:rFonts w:ascii="Consolas" w:hAnsi="Consolas" w:cs="Consolas"/>
-          <w:sz w:val="18"/>
-          <w:szCs w:val="18"/>
-        </w:rPr>
-        <w:t xml:space="preserve"> += number</w:t>
-      </w:r>
-    </w:p>
-    <w:p>
-      <w:pPr>
-        <w:spacing w:before="40" w:after="40" w:line="240" w:lineRule="auto"/>
-        <w:jc w:val="left"/>
-        <w:rPr>
-          <w:rFonts w:ascii="Consolas" w:hAnsi="Consolas" w:cs="Consolas"/>
-          <w:sz w:val="18"/>
-          <w:szCs w:val="18"/>
-        </w:rPr>
-      </w:pPr>
-      <w:r>
-        <w:rPr>
-          <w:rFonts w:ascii="Consolas" w:hAnsi="Consolas" w:cs="Consolas"/>
-          <w:sz w:val="18"/>
-          <w:szCs w:val="18"/>
-        </w:rPr>
-        <w:t xml:space="preserve">    </w:t>
-      </w:r>
-      <w:proofErr w:type="spellStart"/>
-      <w:r>
-        <w:rPr>
-          <w:rFonts w:ascii="Consolas" w:hAnsi="Consolas" w:cs="Consolas"/>
-          <w:sz w:val="18"/>
-          <w:szCs w:val="18"/>
-        </w:rPr>
-        <w:t>return</w:t>
-      </w:r>
-      <w:proofErr w:type="spellEnd"/>
-      <w:r>
-        <w:rPr>
-          <w:rFonts w:ascii="Consolas" w:hAnsi="Consolas" w:cs="Consolas"/>
-          <w:sz w:val="18"/>
-          <w:szCs w:val="18"/>
-        </w:rPr>
-        <w:t xml:space="preserve"> </w:t>
-      </w:r>
-      <w:proofErr w:type="spellStart"/>
-      <w:r>
-        <w:rPr>
-          <w:rFonts w:ascii="Consolas" w:hAnsi="Consolas" w:cs="Consolas"/>
-          <w:sz w:val="18"/>
-          <w:szCs w:val="18"/>
-        </w:rPr>
-        <w:t>total</w:t>
-      </w:r>
-      <w:proofErr w:type="spellEnd"/>
-    </w:p>
-    <w:p>
-      <w:pPr>
-        <w:spacing w:before="40" w:after="40" w:line="240" w:lineRule="auto"/>
-        <w:jc w:val="left"/>
-        <w:rPr>
-          <w:rFonts w:ascii="Consolas" w:hAnsi="Consolas" w:cs="Consolas"/>
-          <w:sz w:val="18"/>
-          <w:szCs w:val="18"/>
-        </w:rPr>
-      </w:pPr>
-    </w:p>
-    <w:p>
-      <w:pPr>
-        <w:spacing w:before="40" w:after="40" w:line="240" w:lineRule="auto"/>
-        <w:jc w:val="left"/>
-        <w:rPr>
-          <w:rFonts w:ascii="Consolas" w:hAnsi="Consolas" w:cs="Consolas"/>
-          <w:sz w:val="18"/>
-          <w:szCs w:val="18"/>
-        </w:rPr>
-      </w:pPr>
-      <w:proofErr w:type="spellStart"/>
-      <w:r>
-        <w:rPr>
-          <w:rFonts w:ascii="Consolas" w:hAnsi="Consolas" w:cs="Consolas"/>
-          <w:sz w:val="18"/>
-          <w:szCs w:val="18"/>
-        </w:rPr>
-        <w:t>result</w:t>
-      </w:r>
-      <w:proofErr w:type="spellEnd"/>
-      <w:r>
-        <w:rPr>
-          <w:rFonts w:ascii="Consolas" w:hAnsi="Consolas" w:cs="Consolas"/>
-          <w:sz w:val="18"/>
-          <w:szCs w:val="18"/>
-        </w:rPr>
-        <w:t xml:space="preserve"> = </w:t>
-      </w:r>
-      <w:proofErr w:type="spellStart"/>
-      <w:r>
-        <w:rPr>
-          <w:rFonts w:ascii="Consolas" w:hAnsi="Consolas" w:cs="Consolas"/>
-          <w:sz w:val="18"/>
-          <w:szCs w:val="18"/>
-        </w:rPr>
-        <w:t>calculate_sum</w:t>
-      </w:r>
-      <w:proofErr w:type="spellEnd"/>
-      <w:r>
-        <w:rPr>
-          <w:rFonts w:ascii="Consolas" w:hAnsi="Consolas" w:cs="Consolas"/>
-          <w:sz w:val="18"/>
-          <w:szCs w:val="18"/>
-        </w:rPr>
-        <w:t>([1, 2, 3, 4, 5])</w:t>
-      </w:r>
-    </w:p>
-    <w:p>
-      <w:pPr>
-        <w:keepNext/>
-        <w:spacing w:before="40" w:after="40" w:line="240" w:lineRule="auto"/>
-        <w:jc w:val="left"/>
-        <w:rPr>
-          <w:rFonts w:ascii="Consolas" w:hAnsi="Consolas" w:cs="Consolas"/>
-          <w:sz w:val="18"/>
-          <w:szCs w:val="18"/>
-        </w:rPr>
-      </w:pPr>
-      <w:r>
-        <w:rPr>
-          <w:rFonts w:ascii="Consolas" w:hAnsi="Consolas" w:cs="Consolas"/>
-          <w:sz w:val="18"/>
-          <w:szCs w:val="18"/>
-        </w:rPr>
-        <w:t>print(</w:t>
-      </w:r>
-      <w:proofErr w:type="spellStart"/>
-      <w:r>
-        <w:rPr>
-          <w:rFonts w:ascii="Consolas" w:hAnsi="Consolas" w:cs="Consolas"/>
-          <w:sz w:val="18"/>
-          <w:szCs w:val="18"/>
-        </w:rPr>
-        <w:t>f"Sum</w:t>
-      </w:r>
-      <w:proofErr w:type="spellEnd"/>
-      <w:r>
-        <w:rPr>
-          <w:rFonts w:ascii="Consolas" w:hAnsi="Consolas" w:cs="Consolas"/>
-          <w:sz w:val="18"/>
-          <w:szCs w:val="18"/>
-        </w:rPr>
-        <w:t>: {</w:t>
-      </w:r>
-      <w:proofErr w:type="spellStart"/>
-      <w:r>
-        <w:rPr>
-          <w:rFonts w:ascii="Consolas" w:hAnsi="Consolas" w:cs="Consolas"/>
-          <w:sz w:val="18"/>
-          <w:szCs w:val="18"/>
-        </w:rPr>
-        <w:t>result</w:t>
-      </w:r>
-      <w:proofErr w:type="spellEnd"/>
-      <w:r>
-        <w:rPr>
-          <w:rFonts w:ascii="Consolas" w:hAnsi="Consolas" w:cs="Consolas"/>
-          <w:sz w:val="18"/>
-          <w:szCs w:val="18"/>
-        </w:rPr>
-        <w:t>}")</w:t>
+        <w:t>print(f"Sum: {result}")</w:t>
       </w:r>
     </w:p>
     <w:p>
@@ -8097,21 +4719,8 @@
         <w:t xml:space="preserve"> „</w:t>
       </w:r>
       <w:r>
-        <w:t xml:space="preserve">Lõputöö </w:t>
-      </w:r>
-      <w:proofErr w:type="spellStart"/>
-      <w:r>
-        <w:t>validaator</w:t>
-      </w:r>
-      <w:proofErr w:type="spellEnd"/>
-      <w:r>
-        <w:t xml:space="preserve">: korrektne </w:t>
-      </w:r>
-      <w:proofErr w:type="spellStart"/>
-      <w:r>
-        <w:t>testtdokument</w:t>
-      </w:r>
-      <w:proofErr w:type="spellEnd"/>
+        <w:t>Lõputöö validaator: korrektne testtdokument</w:t>
+      </w:r>
       <w:r>
         <w:t>“</w:t>
       </w:r>

</xml_diff>